<commit_message>
Circuit Lab 2: moved dmm prelab questions to previous lab
also tweaked resistor figures.
</commit_message>
<xml_diff>
--- a/StudentGuideModule2/electric_circuits2/circ_diag1.docx
+++ b/StudentGuideModule2/electric_circuits2/circ_diag1.docx
@@ -1,6 +1,6 @@
 
 <file path=word/document.xml><?xml version="1.0" encoding="utf-8"?>
-<w:document xmlns:wpc="http://schemas.microsoft.com/office/word/2010/wordprocessingCanvas" xmlns:mc="http://schemas.openxmlformats.org/markup-compatibility/2006" xmlns:o="urn:schemas-microsoft-com:office:office" xmlns:r="http://schemas.openxmlformats.org/officeDocument/2006/relationships" xmlns:m="http://schemas.openxmlformats.org/officeDocument/2006/math" xmlns:v="urn:schemas-microsoft-com:vml" xmlns:wp14="http://schemas.microsoft.com/office/word/2010/wordprocessingDrawing" xmlns:wp="http://schemas.openxmlformats.org/drawingml/2006/wordprocessingDrawing" xmlns:w10="urn:schemas-microsoft-com:office:word" xmlns:w="http://schemas.openxmlformats.org/wordprocessingml/2006/main" xmlns:w14="http://schemas.microsoft.com/office/word/2010/wordml" xmlns:wpg="http://schemas.microsoft.com/office/word/2010/wordprocessingGroup" xmlns:wpi="http://schemas.microsoft.com/office/word/2010/wordprocessingInk" xmlns:wne="http://schemas.microsoft.com/office/word/2006/wordml" xmlns:wps="http://schemas.microsoft.com/office/word/2010/wordprocessingShape" mc:Ignorable="w14 wp14">
+<w:document xmlns:wpc="http://schemas.microsoft.com/office/word/2010/wordprocessingCanvas" xmlns:cx="http://schemas.microsoft.com/office/drawing/2014/chartex" xmlns:cx1="http://schemas.microsoft.com/office/drawing/2015/9/8/chartex" xmlns:cx2="http://schemas.microsoft.com/office/drawing/2015/10/21/chartex" xmlns:cx3="http://schemas.microsoft.com/office/drawing/2016/5/9/chartex" xmlns:cx4="http://schemas.microsoft.com/office/drawing/2016/5/10/chartex" xmlns:cx5="http://schemas.microsoft.com/office/drawing/2016/5/11/chartex" xmlns:cx6="http://schemas.microsoft.com/office/drawing/2016/5/12/chartex" xmlns:cx7="http://schemas.microsoft.com/office/drawing/2016/5/13/chartex" xmlns:cx8="http://schemas.microsoft.com/office/drawing/2016/5/14/chartex" xmlns:mc="http://schemas.openxmlformats.org/markup-compatibility/2006" xmlns:aink="http://schemas.microsoft.com/office/drawing/2016/ink" xmlns:am3d="http://schemas.microsoft.com/office/drawing/2017/model3d" xmlns:o="urn:schemas-microsoft-com:office:office" xmlns:oel="http://schemas.microsoft.com/office/2019/extlst" xmlns:r="http://schemas.openxmlformats.org/officeDocument/2006/relationships" xmlns:m="http://schemas.openxmlformats.org/officeDocument/2006/math" xmlns:v="urn:schemas-microsoft-com:vml" xmlns:wp14="http://schemas.microsoft.com/office/word/2010/wordprocessingDrawing" xmlns:wp="http://schemas.openxmlformats.org/drawingml/2006/wordprocessingDrawing" xmlns:w10="urn:schemas-microsoft-com:office:word" xmlns:w="http://schemas.openxmlformats.org/wordprocessingml/2006/main" xmlns:w14="http://schemas.microsoft.com/office/word/2010/wordml" xmlns:w15="http://schemas.microsoft.com/office/word/2012/wordml" xmlns:w16cex="http://schemas.microsoft.com/office/word/2018/wordml/cex" xmlns:w16cid="http://schemas.microsoft.com/office/word/2016/wordml/cid" xmlns:w16="http://schemas.microsoft.com/office/word/2018/wordml" xmlns:w16du="http://schemas.microsoft.com/office/word/2023/wordml/word16du" xmlns:w16sdtdh="http://schemas.microsoft.com/office/word/2020/wordml/sdtdatahash" xmlns:w16sdtfl="http://schemas.microsoft.com/office/word/2024/wordml/sdtformatlock" xmlns:w16se="http://schemas.microsoft.com/office/word/2015/wordml/symex" xmlns:wpg="http://schemas.microsoft.com/office/word/2010/wordprocessingGroup" xmlns:wpi="http://schemas.microsoft.com/office/word/2010/wordprocessingInk" xmlns:wne="http://schemas.microsoft.com/office/word/2006/wordml" xmlns:wps="http://schemas.microsoft.com/office/word/2010/wordprocessingShape" mc:Ignorable="w14 w15 w16se w16cid w16 w16cex w16sdtdh w16sdtfl w16du wp14">
   <w:body>
     <w:p>
       <w:pPr>
@@ -11,7 +11,6 @@
           <w:szCs w:val="24"/>
         </w:rPr>
       </w:pPr>
-      <w:bookmarkStart w:id="0" w:name="_GoBack"/>
       <w:r>
         <w:rPr>
           <w:noProof/>
@@ -19,15 +18,321 @@
         <mc:AlternateContent>
           <mc:Choice Requires="wpg">
             <w:drawing>
-              <wp:anchor distT="0" distB="0" distL="114300" distR="114300" simplePos="0" relativeHeight="251659264" behindDoc="0" locked="0" layoutInCell="1" allowOverlap="1" wp14:anchorId="77A0E198" wp14:editId="71FB847E">
+              <wp:anchor distT="0" distB="0" distL="114300" distR="114300" simplePos="0" relativeHeight="251661312" behindDoc="0" locked="0" layoutInCell="1" allowOverlap="1" wp14:anchorId="7379CD37" wp14:editId="0BC5F38F">
                 <wp:simplePos x="0" y="0"/>
                 <wp:positionH relativeFrom="column">
-                  <wp:posOffset>749935</wp:posOffset>
+                  <wp:posOffset>733425</wp:posOffset>
                 </wp:positionH>
                 <wp:positionV relativeFrom="paragraph">
-                  <wp:posOffset>4518660</wp:posOffset>
+                  <wp:posOffset>991235</wp:posOffset>
                 </wp:positionV>
-                <wp:extent cx="1980565" cy="919480"/>
+                <wp:extent cx="240030" cy="222885"/>
+                <wp:effectExtent l="0" t="0" r="26670" b="43815"/>
+                <wp:wrapNone/>
+                <wp:docPr id="285542912" name="Group 20"/>
+                <wp:cNvGraphicFramePr/>
+                <a:graphic xmlns:a="http://schemas.openxmlformats.org/drawingml/2006/main">
+                  <a:graphicData uri="http://schemas.microsoft.com/office/word/2010/wordprocessingGroup">
+                    <wpg:wgp>
+                      <wpg:cNvGrpSpPr/>
+                      <wpg:grpSpPr>
+                        <a:xfrm>
+                          <a:off x="0" y="0"/>
+                          <a:ext cx="240030" cy="222885"/>
+                          <a:chOff x="0" y="0"/>
+                          <a:chExt cx="240030" cy="222885"/>
+                        </a:xfrm>
+                      </wpg:grpSpPr>
+                      <wps:wsp>
+                        <wps:cNvPr id="161886821" name="Rectangle 16"/>
+                        <wps:cNvSpPr/>
+                        <wps:spPr>
+                          <a:xfrm>
+                            <a:off x="57150" y="64770"/>
+                            <a:ext cx="140970" cy="158115"/>
+                          </a:xfrm>
+                          <a:prstGeom prst="rect">
+                            <a:avLst/>
+                          </a:prstGeom>
+                          <a:solidFill>
+                            <a:schemeClr val="bg1"/>
+                          </a:solidFill>
+                          <a:ln>
+                            <a:noFill/>
+                          </a:ln>
+                        </wps:spPr>
+                        <wps:style>
+                          <a:lnRef idx="2">
+                            <a:schemeClr val="accent1">
+                              <a:shade val="15000"/>
+                            </a:schemeClr>
+                          </a:lnRef>
+                          <a:fillRef idx="1">
+                            <a:schemeClr val="accent1"/>
+                          </a:fillRef>
+                          <a:effectRef idx="0">
+                            <a:schemeClr val="accent1"/>
+                          </a:effectRef>
+                          <a:fontRef idx="minor">
+                            <a:schemeClr val="lt1"/>
+                          </a:fontRef>
+                        </wps:style>
+                        <wps:bodyPr rot="0" spcFirstLastPara="0" vertOverflow="overflow" horzOverflow="overflow" vert="horz" wrap="square" lIns="91440" tIns="45720" rIns="91440" bIns="45720" numCol="1" spcCol="0" rtlCol="0" fromWordArt="0" anchor="ctr" anchorCtr="0" forceAA="0" compatLnSpc="1">
+                          <a:prstTxWarp prst="textNoShape">
+                            <a:avLst/>
+                          </a:prstTxWarp>
+                          <a:noAutofit/>
+                        </wps:bodyPr>
+                      </wps:wsp>
+                      <wps:wsp>
+                        <wps:cNvPr id="1839918727" name="AutoShape 18"/>
+                        <wps:cNvCnPr>
+                          <a:cxnSpLocks noChangeShapeType="1"/>
+                        </wps:cNvCnPr>
+                        <wps:spPr bwMode="auto">
+                          <a:xfrm>
+                            <a:off x="11430" y="167640"/>
+                            <a:ext cx="228600" cy="0"/>
+                          </a:xfrm>
+                          <a:prstGeom prst="straightConnector1">
+                            <a:avLst/>
+                          </a:prstGeom>
+                          <a:noFill/>
+                          <a:ln w="12700">
+                            <a:solidFill>
+                              <a:srgbClr val="000000"/>
+                            </a:solidFill>
+                            <a:round/>
+                            <a:headEnd/>
+                            <a:tailEnd/>
+                          </a:ln>
+                          <a:extLst>
+                            <a:ext uri="{909E8E84-426E-40DD-AFC4-6F175D3DCCD1}">
+                              <a14:hiddenFill xmlns:a14="http://schemas.microsoft.com/office/drawing/2010/main">
+                                <a:noFill/>
+                              </a14:hiddenFill>
+                            </a:ext>
+                          </a:extLst>
+                        </wps:spPr>
+                        <wps:bodyPr/>
+                      </wps:wsp>
+                      <wps:wsp>
+                        <wps:cNvPr id="982000698" name="AutoShape 19"/>
+                        <wps:cNvCnPr>
+                          <a:cxnSpLocks noChangeShapeType="1"/>
+                        </wps:cNvCnPr>
+                        <wps:spPr bwMode="auto">
+                          <a:xfrm flipV="1">
+                            <a:off x="80010" y="220980"/>
+                            <a:ext cx="91440" cy="1014"/>
+                          </a:xfrm>
+                          <a:prstGeom prst="straightConnector1">
+                            <a:avLst/>
+                          </a:prstGeom>
+                          <a:noFill/>
+                          <a:ln w="12700">
+                            <a:solidFill>
+                              <a:srgbClr val="000000"/>
+                            </a:solidFill>
+                            <a:round/>
+                            <a:headEnd/>
+                            <a:tailEnd/>
+                          </a:ln>
+                          <a:extLst>
+                            <a:ext uri="{909E8E84-426E-40DD-AFC4-6F175D3DCCD1}">
+                              <a14:hiddenFill xmlns:a14="http://schemas.microsoft.com/office/drawing/2010/main">
+                                <a:noFill/>
+                              </a14:hiddenFill>
+                            </a:ext>
+                          </a:extLst>
+                        </wps:spPr>
+                        <wps:bodyPr/>
+                      </wps:wsp>
+                      <wps:wsp>
+                        <wps:cNvPr id="676510980" name="AutoShape 18"/>
+                        <wps:cNvCnPr>
+                          <a:cxnSpLocks noChangeShapeType="1"/>
+                        </wps:cNvCnPr>
+                        <wps:spPr bwMode="auto">
+                          <a:xfrm>
+                            <a:off x="11430" y="64770"/>
+                            <a:ext cx="228600" cy="0"/>
+                          </a:xfrm>
+                          <a:prstGeom prst="straightConnector1">
+                            <a:avLst/>
+                          </a:prstGeom>
+                          <a:noFill/>
+                          <a:ln w="12700">
+                            <a:solidFill>
+                              <a:srgbClr val="000000"/>
+                            </a:solidFill>
+                            <a:round/>
+                            <a:headEnd/>
+                            <a:tailEnd/>
+                          </a:ln>
+                          <a:extLst>
+                            <a:ext uri="{909E8E84-426E-40DD-AFC4-6F175D3DCCD1}">
+                              <a14:hiddenFill xmlns:a14="http://schemas.microsoft.com/office/drawing/2010/main">
+                                <a:noFill/>
+                              </a14:hiddenFill>
+                            </a:ext>
+                          </a:extLst>
+                        </wps:spPr>
+                        <wps:bodyPr/>
+                      </wps:wsp>
+                      <wps:wsp>
+                        <wps:cNvPr id="576231048" name="AutoShape 19"/>
+                        <wps:cNvCnPr>
+                          <a:cxnSpLocks noChangeShapeType="1"/>
+                        </wps:cNvCnPr>
+                        <wps:spPr bwMode="auto">
+                          <a:xfrm flipV="1">
+                            <a:off x="80010" y="114300"/>
+                            <a:ext cx="91440" cy="1014"/>
+                          </a:xfrm>
+                          <a:prstGeom prst="straightConnector1">
+                            <a:avLst/>
+                          </a:prstGeom>
+                          <a:noFill/>
+                          <a:ln w="12700">
+                            <a:solidFill>
+                              <a:srgbClr val="000000"/>
+                            </a:solidFill>
+                            <a:round/>
+                            <a:headEnd/>
+                            <a:tailEnd/>
+                          </a:ln>
+                          <a:extLst>
+                            <a:ext uri="{909E8E84-426E-40DD-AFC4-6F175D3DCCD1}">
+                              <a14:hiddenFill xmlns:a14="http://schemas.microsoft.com/office/drawing/2010/main">
+                                <a:noFill/>
+                              </a14:hiddenFill>
+                            </a:ext>
+                          </a:extLst>
+                        </wps:spPr>
+                        <wps:bodyPr/>
+                      </wps:wsp>
+                      <wpg:grpSp>
+                        <wpg:cNvPr id="242116144" name="plus"/>
+                        <wpg:cNvGrpSpPr/>
+                        <wpg:grpSpPr>
+                          <a:xfrm>
+                            <a:off x="0" y="0"/>
+                            <a:ext cx="45720" cy="45720"/>
+                            <a:chOff x="0" y="0"/>
+                            <a:chExt cx="57150" cy="55245"/>
+                          </a:xfrm>
+                        </wpg:grpSpPr>
+                        <wps:wsp>
+                          <wps:cNvPr id="1378675102" name="Straight Connector 17"/>
+                          <wps:cNvCnPr/>
+                          <wps:spPr>
+                            <a:xfrm>
+                              <a:off x="0" y="26670"/>
+                              <a:ext cx="57150" cy="0"/>
+                            </a:xfrm>
+                            <a:prstGeom prst="line">
+                              <a:avLst/>
+                            </a:prstGeom>
+                            <a:ln w="6350">
+                              <a:solidFill>
+                                <a:schemeClr val="tx1"/>
+                              </a:solidFill>
+                            </a:ln>
+                          </wps:spPr>
+                          <wps:style>
+                            <a:lnRef idx="1">
+                              <a:schemeClr val="accent1"/>
+                            </a:lnRef>
+                            <a:fillRef idx="0">
+                              <a:schemeClr val="accent1"/>
+                            </a:fillRef>
+                            <a:effectRef idx="0">
+                              <a:schemeClr val="accent1"/>
+                            </a:effectRef>
+                            <a:fontRef idx="minor">
+                              <a:schemeClr val="tx1"/>
+                            </a:fontRef>
+                          </wps:style>
+                          <wps:bodyPr/>
+                        </wps:wsp>
+                        <wps:wsp>
+                          <wps:cNvPr id="1182054669" name="Straight Connector 18"/>
+                          <wps:cNvCnPr/>
+                          <wps:spPr>
+                            <a:xfrm>
+                              <a:off x="28575" y="0"/>
+                              <a:ext cx="0" cy="55245"/>
+                            </a:xfrm>
+                            <a:prstGeom prst="line">
+                              <a:avLst/>
+                            </a:prstGeom>
+                            <a:ln w="6350">
+                              <a:solidFill>
+                                <a:schemeClr val="tx1"/>
+                              </a:solidFill>
+                            </a:ln>
+                          </wps:spPr>
+                          <wps:style>
+                            <a:lnRef idx="1">
+                              <a:schemeClr val="accent1"/>
+                            </a:lnRef>
+                            <a:fillRef idx="0">
+                              <a:schemeClr val="accent1"/>
+                            </a:fillRef>
+                            <a:effectRef idx="0">
+                              <a:schemeClr val="accent1"/>
+                            </a:effectRef>
+                            <a:fontRef idx="minor">
+                              <a:schemeClr val="tx1"/>
+                            </a:fontRef>
+                          </wps:style>
+                          <wps:bodyPr/>
+                        </wps:wsp>
+                      </wpg:grpSp>
+                    </wpg:wgp>
+                  </a:graphicData>
+                </a:graphic>
+              </wp:anchor>
+            </w:drawing>
+          </mc:Choice>
+          <mc:Fallback>
+            <w:pict>
+              <v:group w14:anchorId="6E84BB1E" id="Group 20" o:spid="_x0000_s1026" style="position:absolute;margin-left:57.75pt;margin-top:78.05pt;width:18.9pt;height:17.55pt;z-index:251661312" coordsize="240030,222885" o:gfxdata="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">
+                <v:rect id="Rectangle 16" o:spid="_x0000_s1027" style="position:absolute;left:57150;top:64770;width:140970;height:158115;visibility:visible;mso-wrap-style:square;v-text-anchor:middle" o:gfxdata="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" fillcolor="white [3212]" stroked="f" strokeweight="2pt"/>
+                <v:shapetype id="_x0000_t32" coordsize="21600,21600" o:spt="32" o:oned="t" path="m,l21600,21600e" filled="f">
+                  <v:path arrowok="t" fillok="f" o:connecttype="none"/>
+                  <o:lock v:ext="edit" shapetype="t"/>
+                </v:shapetype>
+                <v:shape id="AutoShape 18" o:spid="_x0000_s1028" type="#_x0000_t32" style="position:absolute;left:11430;top:167640;width:228600;height:0;visibility:visible;mso-wrap-style:square" o:connectortype="straight" o:gfxdata="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" strokeweight="1pt"/>
+                <v:shape id="AutoShape 19" o:spid="_x0000_s1029" type="#_x0000_t32" style="position:absolute;left:80010;top:220980;width:91440;height:1014;flip:y;visibility:visible;mso-wrap-style:square" o:connectortype="straight" o:gfxdata="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" strokeweight="1pt"/>
+                <v:shape id="AutoShape 18" o:spid="_x0000_s1030" type="#_x0000_t32" style="position:absolute;left:11430;top:64770;width:228600;height:0;visibility:visible;mso-wrap-style:square" o:connectortype="straight" o:gfxdata="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" strokeweight="1pt"/>
+                <v:shape id="AutoShape 19" o:spid="_x0000_s1031" type="#_x0000_t32" style="position:absolute;left:80010;top:114300;width:91440;height:1014;flip:y;visibility:visible;mso-wrap-style:square" o:connectortype="straight" o:gfxdata="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" strokeweight="1pt"/>
+                <v:group id="plus" o:spid="_x0000_s1032" style="position:absolute;width:45720;height:45720" coordsize="57150,55245" o:gfxdata="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">
+                  <v:line id="Straight Connector 17" o:spid="_x0000_s1033" style="position:absolute;visibility:visible;mso-wrap-style:square" from="0,26670" to="57150,26670" o:connectortype="straight" o:gfxdata="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" strokecolor="black [3213]" strokeweight=".5pt"/>
+                  <v:line id="Straight Connector 18" o:spid="_x0000_s1034" style="position:absolute;visibility:visible;mso-wrap-style:square" from="28575,0" to="28575,55245" o:connectortype="straight" o:gfxdata="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" strokecolor="black [3213]" strokeweight=".5pt"/>
+                </v:group>
+              </v:group>
+            </w:pict>
+          </mc:Fallback>
+        </mc:AlternateContent>
+      </w:r>
+      <w:r>
+        <w:rPr>
+          <w:noProof/>
+        </w:rPr>
+        <mc:AlternateContent>
+          <mc:Choice Requires="wpg">
+            <w:drawing>
+              <wp:anchor distT="0" distB="0" distL="114300" distR="114300" simplePos="0" relativeHeight="251659264" behindDoc="0" locked="0" layoutInCell="1" allowOverlap="1" wp14:anchorId="77A0E198" wp14:editId="351E6D20">
+                <wp:simplePos x="0" y="0"/>
+                <wp:positionH relativeFrom="column">
+                  <wp:posOffset>858838</wp:posOffset>
+                </wp:positionH>
+                <wp:positionV relativeFrom="paragraph">
+                  <wp:posOffset>628650</wp:posOffset>
+                </wp:positionV>
+                <wp:extent cx="1748155" cy="919480"/>
                 <wp:effectExtent l="0" t="0" r="0" b="13970"/>
                 <wp:wrapNone/>
                 <wp:docPr id="494" name="Group 494"/>
@@ -43,89 +348,11 @@
                       <wpg:grpSpPr bwMode="auto">
                         <a:xfrm>
                           <a:off x="0" y="0"/>
-                          <a:ext cx="1980565" cy="919480"/>
-                          <a:chOff x="2115" y="9610"/>
-                          <a:chExt cx="3119" cy="1448"/>
+                          <a:ext cx="1748155" cy="919480"/>
+                          <a:chOff x="2481" y="9610"/>
+                          <a:chExt cx="2753" cy="1448"/>
                         </a:xfrm>
                       </wpg:grpSpPr>
-                      <wpg:grpSp>
-                        <wpg:cNvPr id="495" name="Group 432"/>
-                        <wpg:cNvGrpSpPr>
-                          <a:grpSpLocks/>
-                        </wpg:cNvGrpSpPr>
-                        <wpg:grpSpPr bwMode="auto">
-                          <a:xfrm>
-                            <a:off x="2115" y="10363"/>
-                            <a:ext cx="765" cy="154"/>
-                            <a:chOff x="3930" y="12735"/>
-                            <a:chExt cx="765" cy="154"/>
-                          </a:xfrm>
-                        </wpg:grpSpPr>
-                        <wps:wsp>
-                          <wps:cNvPr id="496" name="AutoShape 433"/>
-                          <wps:cNvCnPr>
-                            <a:cxnSpLocks noChangeShapeType="1"/>
-                          </wps:cNvCnPr>
-                          <wps:spPr bwMode="auto">
-                            <a:xfrm>
-                              <a:off x="3930" y="12735"/>
-                              <a:ext cx="765" cy="0"/>
-                            </a:xfrm>
-                            <a:prstGeom prst="straightConnector1">
-                              <a:avLst/>
-                            </a:prstGeom>
-                            <a:noFill/>
-                            <a:ln w="19050">
-                              <a:solidFill>
-                                <a:srgbClr val="000000"/>
-                              </a:solidFill>
-                              <a:round/>
-                              <a:headEnd/>
-                              <a:tailEnd/>
-                            </a:ln>
-                            <a:extLst>
-                              <a:ext uri="{909E8E84-426E-40DD-AFC4-6F175D3DCCD1}">
-                                <a14:hiddenFill xmlns:a14="http://schemas.microsoft.com/office/drawing/2010/main">
-                                  <a:noFill/>
-                                </a14:hiddenFill>
-                              </a:ext>
-                            </a:extLst>
-                          </wps:spPr>
-                          <wps:bodyPr/>
-                        </wps:wsp>
-                        <wps:wsp>
-                          <wps:cNvPr id="497" name="AutoShape 434"/>
-                          <wps:cNvCnPr>
-                            <a:cxnSpLocks noChangeShapeType="1"/>
-                          </wps:cNvCnPr>
-                          <wps:spPr bwMode="auto">
-                            <a:xfrm flipV="1">
-                              <a:off x="4196" y="12886"/>
-                              <a:ext cx="199" cy="3"/>
-                            </a:xfrm>
-                            <a:prstGeom prst="straightConnector1">
-                              <a:avLst/>
-                            </a:prstGeom>
-                            <a:noFill/>
-                            <a:ln w="19050">
-                              <a:solidFill>
-                                <a:srgbClr val="000000"/>
-                              </a:solidFill>
-                              <a:round/>
-                              <a:headEnd/>
-                              <a:tailEnd/>
-                            </a:ln>
-                            <a:extLst>
-                              <a:ext uri="{909E8E84-426E-40DD-AFC4-6F175D3DCCD1}">
-                                <a14:hiddenFill xmlns:a14="http://schemas.microsoft.com/office/drawing/2010/main">
-                                  <a:noFill/>
-                                </a14:hiddenFill>
-                              </a:ext>
-                            </a:extLst>
-                          </wps:spPr>
-                          <wps:bodyPr/>
-                        </wps:wsp>
-                      </wpg:grpSp>
                       <wpg:grpSp>
                         <wpg:cNvPr id="498" name="Group 435"/>
                         <wpg:cNvGrpSpPr>
@@ -997,30 +1224,22 @@
           </mc:Choice>
           <mc:Fallback>
             <w:pict>
-              <v:group id="Group 494" o:spid="_x0000_s1026" style="position:absolute;margin-left:59.05pt;margin-top:355.8pt;width:155.95pt;height:72.4pt;z-index:251659264" coordorigin="2115,9610" coordsize="3119,1448" o:gfxdata="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">
-                <v:group id="Group 432" o:spid="_x0000_s1027" style="position:absolute;left:2115;top:10363;width:765;height:154" coordorigin="3930,12735" coordsize="765,154" o:gfxdata="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">
-                  <v:shapetype id="_x0000_t32" coordsize="21600,21600" o:spt="32" o:oned="t" path="m,l21600,21600e" filled="f">
-                    <v:path arrowok="t" fillok="f" o:connecttype="none"/>
-                    <o:lock v:ext="edit" shapetype="t"/>
-                  </v:shapetype>
-                  <v:shape id="AutoShape 433" o:spid="_x0000_s1028" type="#_x0000_t32" style="position:absolute;left:3930;top:12735;width:765;height:0;visibility:visible;mso-wrap-style:square" o:connectortype="straight" o:gfxdata="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" strokeweight="1.5pt"/>
-                  <v:shape id="AutoShape 434" o:spid="_x0000_s1029" type="#_x0000_t32" style="position:absolute;left:4196;top:12886;width:199;height:3;flip:y;visibility:visible;mso-wrap-style:square" o:connectortype="straight" o:gfxdata="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" strokeweight="1.5pt"/>
-                </v:group>
-                <v:group id="Group 435" o:spid="_x0000_s1030" style="position:absolute;left:3998;top:10260;width:580;height:345" coordorigin="5430,12705" coordsize="580,345" o:gfxdata="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">
-                  <v:oval id="Oval 436" o:spid="_x0000_s1031" style="position:absolute;left:5665;top:12705;width:345;height:345;visibility:visible;mso-wrap-style:square;v-text-anchor:top" o:gfxdata="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" strokeweight="1pt"/>
-                  <v:shape id="AutoShape 437" o:spid="_x0000_s1032" type="#_x0000_t32" style="position:absolute;left:5430;top:12795;width:375;height:0;visibility:visible;mso-wrap-style:square" o:connectortype="straight" o:gfxdata="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" strokeweight="1pt"/>
-                  <v:shape id="AutoShape 438" o:spid="_x0000_s1033" type="#_x0000_t32" style="position:absolute;left:5430;top:12970;width:375;height:0;visibility:visible;mso-wrap-style:square" o:connectortype="straight" o:gfxdata="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" strokeweight="1pt"/>
-                  <v:shape id="Freeform 439" o:spid="_x0000_s1034" style="position:absolute;left:5727;top:12799;width:140;height:165;visibility:visible;mso-wrap-style:square;v-text-anchor:top" coordsize="140,193" o:gfxdata="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" path="m73,v38,28,21,18,49,32c95,41,,32,61,44v24,16,29,18,57,24c97,75,74,73,53,80v-20,31,34,27,53,29c81,112,70,109,57,129v4,3,7,7,12,8c105,145,140,136,90,153,74,167,65,170,65,193e" filled="f" strokeweight="1pt">
+              <v:group w14:anchorId="77A0E198" id="Group 494" o:spid="_x0000_s1026" style="position:absolute;margin-left:67.65pt;margin-top:49.5pt;width:137.65pt;height:72.4pt;z-index:251659264" coordorigin="2481,9610" coordsize="2753,1448" o:gfxdata="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">
+                <v:group id="Group 435" o:spid="_x0000_s1027" style="position:absolute;left:3998;top:10260;width:580;height:345" coordorigin="5430,12705" coordsize="580,345" o:gfxdata="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">
+                  <v:oval id="Oval 436" o:spid="_x0000_s1028" style="position:absolute;left:5665;top:12705;width:345;height:345;visibility:visible;mso-wrap-style:square;v-text-anchor:top" o:gfxdata="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" strokeweight="1pt"/>
+                  <v:shape id="AutoShape 437" o:spid="_x0000_s1029" type="#_x0000_t32" style="position:absolute;left:5430;top:12795;width:375;height:0;visibility:visible;mso-wrap-style:square" o:connectortype="straight" o:gfxdata="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" strokeweight="1pt"/>
+                  <v:shape id="AutoShape 438" o:spid="_x0000_s1030" type="#_x0000_t32" style="position:absolute;left:5430;top:12970;width:375;height:0;visibility:visible;mso-wrap-style:square" o:connectortype="straight" o:gfxdata="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" strokeweight="1pt"/>
+                  <v:shape id="Freeform 439" o:spid="_x0000_s1031" style="position:absolute;left:5727;top:12799;width:140;height:165;visibility:visible;mso-wrap-style:square;v-text-anchor:top" coordsize="140,193" o:gfxdata="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" path="m73,v38,28,21,18,49,32c95,41,,32,61,44v24,16,29,18,57,24c97,75,74,73,53,80v-20,31,34,27,53,29c81,112,70,109,57,129v4,3,7,7,12,8c105,145,140,136,90,153,74,167,65,170,65,193e" filled="f" strokeweight="1pt">
                     <v:path arrowok="t" o:connecttype="custom" o:connectlocs="73,0;122,27;61,38;118,58;53,68;106,93;57,110;69,117;90,131;65,165" o:connectangles="0,0,0,0,0,0,0,0,0,0"/>
                   </v:shape>
                 </v:group>
-                <v:group id="Group 440" o:spid="_x0000_s1035" style="position:absolute;left:3039;top:9610;width:468;height:424" coordorigin="4787,12294" coordsize="468,424" o:gfxdata="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">
-                  <v:oval id="Oval 441" o:spid="_x0000_s1036" style="position:absolute;left:4832;top:12347;width:319;height:319;visibility:visible;mso-wrap-style:square;v-text-anchor:top" o:gfxdata="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"/>
+                <v:group id="Group 440" o:spid="_x0000_s1032" style="position:absolute;left:3039;top:9610;width:468;height:424" coordorigin="4787,12294" coordsize="468,424" o:gfxdata="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">
+                  <v:oval id="Oval 441" o:spid="_x0000_s1033" style="position:absolute;left:4832;top:12347;width:319;height:319;visibility:visible;mso-wrap-style:square;v-text-anchor:top" o:gfxdata="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"/>
                   <v:shapetype id="_x0000_t202" coordsize="21600,21600" o:spt="202" path="m,l,21600r21600,l21600,xe">
                     <v:stroke joinstyle="miter"/>
                     <v:path gradientshapeok="t" o:connecttype="rect"/>
                   </v:shapetype>
-                  <v:shape id="Text Box 442" o:spid="_x0000_s1037" type="#_x0000_t202" style="position:absolute;left:4787;top:12294;width:468;height:424;visibility:visible;mso-wrap-style:square;v-text-anchor:top" o:gfxdata="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" filled="f" stroked="f">
+                  <v:shape id="Text Box 442" o:spid="_x0000_s1034" type="#_x0000_t202" style="position:absolute;left:4787;top:12294;width:468;height:424;visibility:visible;mso-wrap-style:square;v-text-anchor:top" o:gfxdata="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" filled="f" stroked="f">
                     <v:textbox>
                       <w:txbxContent>
                         <w:p>
@@ -1032,27 +1251,27 @@
                     </v:textbox>
                   </v:shape>
                 </v:group>
-                <v:shape id="Freeform 443" o:spid="_x0000_s1038" style="position:absolute;left:2481;top:9822;width:597;height:536;visibility:visible;mso-wrap-style:square;v-text-anchor:top" coordsize="597,536" o:gfxdata="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" path="m,536l,,597,e" filled="f">
+                <v:shape id="Freeform 443" o:spid="_x0000_s1035" style="position:absolute;left:2481;top:9822;width:597;height:536;visibility:visible;mso-wrap-style:square;v-text-anchor:top" coordsize="597,536" o:gfxdata="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" path="m,536l,,597,e" filled="f">
                   <v:path arrowok="t" o:connecttype="custom" o:connectlocs="0,536;0,0;597,0" o:connectangles="0,0,0"/>
                 </v:shape>
-                <v:shape id="Freeform 444" o:spid="_x0000_s1039" style="position:absolute;left:3399;top:9816;width:597;height:536;flip:x;visibility:visible;mso-wrap-style:square;v-text-anchor:top" coordsize="597,536" o:gfxdata="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" path="m,536l,,597,e" filled="f">
+                <v:shape id="Freeform 444" o:spid="_x0000_s1036" style="position:absolute;left:3399;top:9816;width:597;height:536;flip:x;visibility:visible;mso-wrap-style:square;v-text-anchor:top" coordsize="597,536" o:gfxdata="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" path="m,536l,,597,e" filled="f">
                   <v:path arrowok="t" o:connecttype="custom" o:connectlocs="0,536;0,0;597,0" o:connectangles="0,0,0"/>
                 </v:shape>
-                <v:shape id="Freeform 445" o:spid="_x0000_s1040" style="position:absolute;left:2487;top:10522;width:597;height:536;flip:y;visibility:visible;mso-wrap-style:square;v-text-anchor:top" coordsize="597,536" o:gfxdata="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" path="m,536l,,597,e" filled="f">
+                <v:shape id="Freeform 445" o:spid="_x0000_s1037" style="position:absolute;left:2487;top:10522;width:597;height:536;flip:y;visibility:visible;mso-wrap-style:square;v-text-anchor:top" coordsize="597,536" o:gfxdata="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" path="m,536l,,597,e" filled="f">
                   <v:path arrowok="t" o:connecttype="custom" o:connectlocs="0,536;0,0;597,0" o:connectangles="0,0,0"/>
                 </v:shape>
-                <v:shape id="Freeform 446" o:spid="_x0000_s1041" style="position:absolute;left:3039;top:10522;width:963;height:536;flip:x y;visibility:visible;mso-wrap-style:square;v-text-anchor:top" coordsize="597,536" o:gfxdata="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" path="m,536l,,597,e" filled="f">
+                <v:shape id="Freeform 446" o:spid="_x0000_s1038" style="position:absolute;left:3039;top:10522;width:963;height:536;flip:x y;visibility:visible;mso-wrap-style:square;v-text-anchor:top" coordsize="597,536" o:gfxdata="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" path="m,536l,,597,e" filled="f">
                   <v:path arrowok="t" o:connecttype="custom" o:connectlocs="0,536;0,0;963,0" o:connectangles="0,0,0"/>
                 </v:shape>
-                <v:shape id="Freeform 447" o:spid="_x0000_s1042" style="position:absolute;left:4002;top:10350;width:963;height:536;flip:x y;visibility:visible;mso-wrap-style:square;v-text-anchor:top" coordsize="597,536" o:gfxdata="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" path="m,536l,,597,e" filled="f">
+                <v:shape id="Freeform 447" o:spid="_x0000_s1039" style="position:absolute;left:4002;top:10350;width:963;height:536;flip:x y;visibility:visible;mso-wrap-style:square;v-text-anchor:top" coordsize="597,536" o:gfxdata="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" path="m,536l,,597,e" filled="f">
                   <v:path arrowok="t" o:connecttype="custom" o:connectlocs="0,536;0,0;963,0" o:connectangles="0,0,0"/>
                 </v:shape>
-                <v:shape id="Freeform 448" o:spid="_x0000_s1043" style="position:absolute;left:4002;top:9978;width:963;height:536;flip:x;visibility:visible;mso-wrap-style:square;v-text-anchor:top" coordsize="597,536" o:gfxdata="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" path="m,536l,,597,e" filled="f">
+                <v:shape id="Freeform 448" o:spid="_x0000_s1040" style="position:absolute;left:4002;top:9978;width:963;height:536;flip:x;visibility:visible;mso-wrap-style:square;v-text-anchor:top" coordsize="597,536" o:gfxdata="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" path="m,536l,,597,e" filled="f">
                   <v:path arrowok="t" o:connecttype="custom" o:connectlocs="0,536;0,0;963,0" o:connectangles="0,0,0"/>
                 </v:shape>
-                <v:group id="Group 449" o:spid="_x0000_s1044" style="position:absolute;left:4766;top:10181;width:468;height:424" coordorigin="4787,12294" coordsize="468,424" o:gfxdata="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">
-                  <v:oval id="Oval 450" o:spid="_x0000_s1045" style="position:absolute;left:4832;top:12347;width:319;height:319;visibility:visible;mso-wrap-style:square;v-text-anchor:top" o:gfxdata="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"/>
-                  <v:shape id="Text Box 451" o:spid="_x0000_s1046" type="#_x0000_t202" style="position:absolute;left:4787;top:12294;width:468;height:424;visibility:visible;mso-wrap-style:square;v-text-anchor:top" o:gfxdata="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" filled="f" stroked="f">
+                <v:group id="Group 449" o:spid="_x0000_s1041" style="position:absolute;left:4766;top:10181;width:468;height:424" coordorigin="4787,12294" coordsize="468,424" o:gfxdata="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">
+                  <v:oval id="Oval 450" o:spid="_x0000_s1042" style="position:absolute;left:4832;top:12347;width:319;height:319;visibility:visible;mso-wrap-style:square;v-text-anchor:top" o:gfxdata="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"/>
+                  <v:shape id="Text Box 451" o:spid="_x0000_s1043" type="#_x0000_t202" style="position:absolute;left:4787;top:12294;width:468;height:424;visibility:visible;mso-wrap-style:square;v-text-anchor:top" o:gfxdata="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" filled="f" stroked="f">
                     <v:textbox>
                       <w:txbxContent>
                         <w:p>
@@ -1069,7 +1288,6 @@
           </mc:Fallback>
         </mc:AlternateContent>
       </w:r>
-      <w:bookmarkEnd w:id="0"/>
     </w:p>
     <w:sectPr>
       <w:pgSz w:w="12240" w:h="15840"/>
@@ -1081,8 +1299,58 @@
 </w:document>
 </file>
 
+<file path=word/endnotes.xml><?xml version="1.0" encoding="utf-8"?>
+<w:endnotes xmlns:wpc="http://schemas.microsoft.com/office/word/2010/wordprocessingCanvas" xmlns:cx="http://schemas.microsoft.com/office/drawing/2014/chartex" xmlns:cx1="http://schemas.microsoft.com/office/drawing/2015/9/8/chartex" xmlns:cx2="http://schemas.microsoft.com/office/drawing/2015/10/21/chartex" xmlns:cx3="http://schemas.microsoft.com/office/drawing/2016/5/9/chartex" xmlns:cx4="http://schemas.microsoft.com/office/drawing/2016/5/10/chartex" xmlns:cx5="http://schemas.microsoft.com/office/drawing/2016/5/11/chartex" xmlns:cx6="http://schemas.microsoft.com/office/drawing/2016/5/12/chartex" xmlns:cx7="http://schemas.microsoft.com/office/drawing/2016/5/13/chartex" xmlns:cx8="http://schemas.microsoft.com/office/drawing/2016/5/14/chartex" xmlns:mc="http://schemas.openxmlformats.org/markup-compatibility/2006" xmlns:aink="http://schemas.microsoft.com/office/drawing/2016/ink" xmlns:am3d="http://schemas.microsoft.com/office/drawing/2017/model3d" xmlns:o="urn:schemas-microsoft-com:office:office" xmlns:oel="http://schemas.microsoft.com/office/2019/extlst" xmlns:r="http://schemas.openxmlformats.org/officeDocument/2006/relationships" xmlns:m="http://schemas.openxmlformats.org/officeDocument/2006/math" xmlns:v="urn:schemas-microsoft-com:vml" xmlns:wp14="http://schemas.microsoft.com/office/word/2010/wordprocessingDrawing" xmlns:wp="http://schemas.openxmlformats.org/drawingml/2006/wordprocessingDrawing" xmlns:w10="urn:schemas-microsoft-com:office:word" xmlns:w="http://schemas.openxmlformats.org/wordprocessingml/2006/main" xmlns:w14="http://schemas.microsoft.com/office/word/2010/wordml" xmlns:w15="http://schemas.microsoft.com/office/word/2012/wordml" xmlns:w16cex="http://schemas.microsoft.com/office/word/2018/wordml/cex" xmlns:w16cid="http://schemas.microsoft.com/office/word/2016/wordml/cid" xmlns:w16="http://schemas.microsoft.com/office/word/2018/wordml" xmlns:w16du="http://schemas.microsoft.com/office/word/2023/wordml/word16du" xmlns:w16sdtdh="http://schemas.microsoft.com/office/word/2020/wordml/sdtdatahash" xmlns:w16sdtfl="http://schemas.microsoft.com/office/word/2024/wordml/sdtformatlock" xmlns:w16se="http://schemas.microsoft.com/office/word/2015/wordml/symex" xmlns:wpg="http://schemas.microsoft.com/office/word/2010/wordprocessingGroup" xmlns:wpi="http://schemas.microsoft.com/office/word/2010/wordprocessingInk" xmlns:wne="http://schemas.microsoft.com/office/word/2006/wordml" xmlns:wps="http://schemas.microsoft.com/office/word/2010/wordprocessingShape" mc:Ignorable="w14 w15 w16se w16cid w16 w16cex w16sdtdh w16sdtfl w16du wp14">
+  <w:endnote w:type="separator" w:id="-1">
+    <w:p>
+      <w:pPr>
+        <w:spacing w:after="0" w:line="240" w:lineRule="auto"/>
+      </w:pPr>
+      <w:r>
+        <w:separator/>
+      </w:r>
+    </w:p>
+  </w:endnote>
+  <w:endnote w:type="continuationSeparator" w:id="0">
+    <w:p>
+      <w:pPr>
+        <w:spacing w:after="0" w:line="240" w:lineRule="auto"/>
+      </w:pPr>
+      <w:r>
+        <w:continuationSeparator/>
+      </w:r>
+    </w:p>
+  </w:endnote>
+</w:endnotes>
+</file>
+
+<file path=word/footnotes.xml><?xml version="1.0" encoding="utf-8"?>
+<w:footnotes xmlns:wpc="http://schemas.microsoft.com/office/word/2010/wordprocessingCanvas" xmlns:cx="http://schemas.microsoft.com/office/drawing/2014/chartex" xmlns:cx1="http://schemas.microsoft.com/office/drawing/2015/9/8/chartex" xmlns:cx2="http://schemas.microsoft.com/office/drawing/2015/10/21/chartex" xmlns:cx3="http://schemas.microsoft.com/office/drawing/2016/5/9/chartex" xmlns:cx4="http://schemas.microsoft.com/office/drawing/2016/5/10/chartex" xmlns:cx5="http://schemas.microsoft.com/office/drawing/2016/5/11/chartex" xmlns:cx6="http://schemas.microsoft.com/office/drawing/2016/5/12/chartex" xmlns:cx7="http://schemas.microsoft.com/office/drawing/2016/5/13/chartex" xmlns:cx8="http://schemas.microsoft.com/office/drawing/2016/5/14/chartex" xmlns:mc="http://schemas.openxmlformats.org/markup-compatibility/2006" xmlns:aink="http://schemas.microsoft.com/office/drawing/2016/ink" xmlns:am3d="http://schemas.microsoft.com/office/drawing/2017/model3d" xmlns:o="urn:schemas-microsoft-com:office:office" xmlns:oel="http://schemas.microsoft.com/office/2019/extlst" xmlns:r="http://schemas.openxmlformats.org/officeDocument/2006/relationships" xmlns:m="http://schemas.openxmlformats.org/officeDocument/2006/math" xmlns:v="urn:schemas-microsoft-com:vml" xmlns:wp14="http://schemas.microsoft.com/office/word/2010/wordprocessingDrawing" xmlns:wp="http://schemas.openxmlformats.org/drawingml/2006/wordprocessingDrawing" xmlns:w10="urn:schemas-microsoft-com:office:word" xmlns:w="http://schemas.openxmlformats.org/wordprocessingml/2006/main" xmlns:w14="http://schemas.microsoft.com/office/word/2010/wordml" xmlns:w15="http://schemas.microsoft.com/office/word/2012/wordml" xmlns:w16cex="http://schemas.microsoft.com/office/word/2018/wordml/cex" xmlns:w16cid="http://schemas.microsoft.com/office/word/2016/wordml/cid" xmlns:w16="http://schemas.microsoft.com/office/word/2018/wordml" xmlns:w16du="http://schemas.microsoft.com/office/word/2023/wordml/word16du" xmlns:w16sdtdh="http://schemas.microsoft.com/office/word/2020/wordml/sdtdatahash" xmlns:w16sdtfl="http://schemas.microsoft.com/office/word/2024/wordml/sdtformatlock" xmlns:w16se="http://schemas.microsoft.com/office/word/2015/wordml/symex" xmlns:wpg="http://schemas.microsoft.com/office/word/2010/wordprocessingGroup" xmlns:wpi="http://schemas.microsoft.com/office/word/2010/wordprocessingInk" xmlns:wne="http://schemas.microsoft.com/office/word/2006/wordml" xmlns:wps="http://schemas.microsoft.com/office/word/2010/wordprocessingShape" mc:Ignorable="w14 w15 w16se w16cid w16 w16cex w16sdtdh w16sdtfl w16du wp14">
+  <w:footnote w:type="separator" w:id="-1">
+    <w:p>
+      <w:pPr>
+        <w:spacing w:after="0" w:line="240" w:lineRule="auto"/>
+      </w:pPr>
+      <w:r>
+        <w:separator/>
+      </w:r>
+    </w:p>
+  </w:footnote>
+  <w:footnote w:type="continuationSeparator" w:id="0">
+    <w:p>
+      <w:pPr>
+        <w:spacing w:after="0" w:line="240" w:lineRule="auto"/>
+      </w:pPr>
+      <w:r>
+        <w:continuationSeparator/>
+      </w:r>
+    </w:p>
+  </w:footnote>
+</w:footnotes>
+</file>
+
 <file path=word/styles.xml><?xml version="1.0" encoding="utf-8"?>
-<w:styles xmlns:mc="http://schemas.openxmlformats.org/markup-compatibility/2006" xmlns:r="http://schemas.openxmlformats.org/officeDocument/2006/relationships" xmlns:w="http://schemas.openxmlformats.org/wordprocessingml/2006/main" xmlns:w14="http://schemas.microsoft.com/office/word/2010/wordml" mc:Ignorable="w14">
+<w:styles xmlns:mc="http://schemas.openxmlformats.org/markup-compatibility/2006" xmlns:r="http://schemas.openxmlformats.org/officeDocument/2006/relationships" xmlns:w="http://schemas.openxmlformats.org/wordprocessingml/2006/main" xmlns:w14="http://schemas.microsoft.com/office/word/2010/wordml" xmlns:w15="http://schemas.microsoft.com/office/word/2012/wordml" xmlns:w16cex="http://schemas.microsoft.com/office/word/2018/wordml/cex" xmlns:w16cid="http://schemas.microsoft.com/office/word/2016/wordml/cid" xmlns:w16="http://schemas.microsoft.com/office/word/2018/wordml" xmlns:w16du="http://schemas.microsoft.com/office/word/2023/wordml/word16du" xmlns:w16sdtdh="http://schemas.microsoft.com/office/word/2020/wordml/sdtdatahash" xmlns:w16sdtfl="http://schemas.microsoft.com/office/word/2024/wordml/sdtformatlock" xmlns:w16se="http://schemas.microsoft.com/office/word/2015/wordml/symex" mc:Ignorable="w14 w15 w16se w16cid w16 w16cex w16sdtdh w16sdtfl w16du">
   <w:docDefaults>
     <w:rPrDefault>
       <w:rPr>
@@ -1098,144 +1366,383 @@
       </w:pPr>
     </w:pPrDefault>
   </w:docDefaults>
-  <w:latentStyles w:defLockedState="0" w:defUIPriority="99" w:defSemiHidden="1" w:defUnhideWhenUsed="1" w:defQFormat="0" w:count="267">
-    <w:lsdException w:name="Normal" w:semiHidden="0" w:uiPriority="0" w:unhideWhenUsed="0" w:qFormat="1"/>
-    <w:lsdException w:name="heading 1" w:semiHidden="0" w:uiPriority="9" w:unhideWhenUsed="0" w:qFormat="1"/>
-    <w:lsdException w:name="heading 2" w:uiPriority="9" w:qFormat="1"/>
-    <w:lsdException w:name="heading 3" w:uiPriority="9" w:qFormat="1"/>
-    <w:lsdException w:name="heading 4" w:uiPriority="9" w:qFormat="1"/>
-    <w:lsdException w:name="heading 5" w:uiPriority="9" w:qFormat="1"/>
-    <w:lsdException w:name="heading 6" w:uiPriority="9" w:qFormat="1"/>
-    <w:lsdException w:name="heading 7" w:uiPriority="9" w:qFormat="1"/>
-    <w:lsdException w:name="heading 8" w:uiPriority="9" w:qFormat="1"/>
-    <w:lsdException w:name="heading 9" w:uiPriority="9" w:qFormat="1"/>
-    <w:lsdException w:name="toc 1" w:uiPriority="39"/>
-    <w:lsdException w:name="toc 2" w:uiPriority="39"/>
-    <w:lsdException w:name="toc 3" w:uiPriority="39"/>
-    <w:lsdException w:name="toc 4" w:uiPriority="39"/>
-    <w:lsdException w:name="toc 5" w:uiPriority="39"/>
-    <w:lsdException w:name="toc 6" w:uiPriority="39"/>
-    <w:lsdException w:name="toc 7" w:uiPriority="39"/>
-    <w:lsdException w:name="toc 8" w:uiPriority="39"/>
-    <w:lsdException w:name="toc 9" w:uiPriority="39"/>
-    <w:lsdException w:name="caption" w:uiPriority="35" w:qFormat="1"/>
-    <w:lsdException w:name="Title" w:semiHidden="0" w:uiPriority="10" w:unhideWhenUsed="0" w:qFormat="1"/>
-    <w:lsdException w:name="Default Paragraph Font" w:uiPriority="1"/>
-    <w:lsdException w:name="Subtitle" w:semiHidden="0" w:uiPriority="11" w:unhideWhenUsed="0" w:qFormat="1"/>
-    <w:lsdException w:name="Strong" w:semiHidden="0" w:uiPriority="22" w:unhideWhenUsed="0" w:qFormat="1"/>
-    <w:lsdException w:name="Emphasis" w:semiHidden="0" w:uiPriority="20" w:unhideWhenUsed="0" w:qFormat="1"/>
-    <w:lsdException w:name="Table Grid" w:semiHidden="0" w:uiPriority="59" w:unhideWhenUsed="0"/>
-    <w:lsdException w:name="Placeholder Text" w:unhideWhenUsed="0"/>
-    <w:lsdException w:name="No Spacing" w:semiHidden="0" w:uiPriority="1" w:unhideWhenUsed="0" w:qFormat="1"/>
-    <w:lsdException w:name="Light Shading" w:semiHidden="0" w:uiPriority="60" w:unhideWhenUsed="0"/>
-    <w:lsdException w:name="Light List" w:semiHidden="0" w:uiPriority="61" w:unhideWhenUsed="0"/>
-    <w:lsdException w:name="Light Grid" w:semiHidden="0" w:uiPriority="62" w:unhideWhenUsed="0"/>
-    <w:lsdException w:name="Medium Shading 1" w:semiHidden="0" w:uiPriority="63" w:unhideWhenUsed="0"/>
-    <w:lsdException w:name="Medium Shading 2" w:semiHidden="0" w:uiPriority="64" w:unhideWhenUsed="0"/>
-    <w:lsdException w:name="Medium List 1" w:semiHidden="0" w:uiPriority="65" w:unhideWhenUsed="0"/>
-    <w:lsdException w:name="Medium List 2" w:semiHidden="0" w:uiPriority="66" w:unhideWhenUsed="0"/>
-    <w:lsdException w:name="Medium Grid 1" w:semiHidden="0" w:uiPriority="67" w:unhideWhenUsed="0"/>
-    <w:lsdException w:name="Medium Grid 2" w:semiHidden="0" w:uiPriority="68" w:unhideWhenUsed="0"/>
-    <w:lsdException w:name="Medium Grid 3" w:semiHidden="0" w:uiPriority="69" w:unhideWhenUsed="0"/>
-    <w:lsdException w:name="Dark List" w:semiHidden="0" w:uiPriority="70" w:unhideWhenUsed="0"/>
-    <w:lsdException w:name="Colorful Shading" w:semiHidden="0" w:uiPriority="71" w:unhideWhenUsed="0"/>
-    <w:lsdException w:name="Colorful List" w:semiHidden="0" w:uiPriority="72" w:unhideWhenUsed="0"/>
-    <w:lsdException w:name="Colorful Grid" w:semiHidden="0" w:uiPriority="73" w:unhideWhenUsed="0"/>
-    <w:lsdException w:name="Light Shading Accent 1" w:semiHidden="0" w:uiPriority="60" w:unhideWhenUsed="0"/>
-    <w:lsdException w:name="Light List Accent 1" w:semiHidden="0" w:uiPriority="61" w:unhideWhenUsed="0"/>
-    <w:lsdException w:name="Light Grid Accent 1" w:semiHidden="0" w:uiPriority="62" w:unhideWhenUsed="0"/>
-    <w:lsdException w:name="Medium Shading 1 Accent 1" w:semiHidden="0" w:uiPriority="63" w:unhideWhenUsed="0"/>
-    <w:lsdException w:name="Medium Shading 2 Accent 1" w:semiHidden="0" w:uiPriority="64" w:unhideWhenUsed="0"/>
-    <w:lsdException w:name="Medium List 1 Accent 1" w:semiHidden="0" w:uiPriority="65" w:unhideWhenUsed="0"/>
-    <w:lsdException w:name="Revision" w:unhideWhenUsed="0"/>
-    <w:lsdException w:name="List Paragraph" w:semiHidden="0" w:uiPriority="34" w:unhideWhenUsed="0" w:qFormat="1"/>
-    <w:lsdException w:name="Quote" w:semiHidden="0" w:uiPriority="29" w:unhideWhenUsed="0" w:qFormat="1"/>
-    <w:lsdException w:name="Intense Quote" w:semiHidden="0" w:uiPriority="30" w:unhideWhenUsed="0" w:qFormat="1"/>
-    <w:lsdException w:name="Medium List 2 Accent 1" w:semiHidden="0" w:uiPriority="66" w:unhideWhenUsed="0"/>
-    <w:lsdException w:name="Medium Grid 1 Accent 1" w:semiHidden="0" w:uiPriority="67" w:unhideWhenUsed="0"/>
-    <w:lsdException w:name="Medium Grid 2 Accent 1" w:semiHidden="0" w:uiPriority="68" w:unhideWhenUsed="0"/>
-    <w:lsdException w:name="Medium Grid 3 Accent 1" w:semiHidden="0" w:uiPriority="69" w:unhideWhenUsed="0"/>
-    <w:lsdException w:name="Dark List Accent 1" w:semiHidden="0" w:uiPriority="70" w:unhideWhenUsed="0"/>
-    <w:lsdException w:name="Colorful Shading Accent 1" w:semiHidden="0" w:uiPriority="71" w:unhideWhenUsed="0"/>
-    <w:lsdException w:name="Colorful List Accent 1" w:semiHidden="0" w:uiPriority="72" w:unhideWhenUsed="0"/>
-    <w:lsdException w:name="Colorful Grid Accent 1" w:semiHidden="0" w:uiPriority="73" w:unhideWhenUsed="0"/>
-    <w:lsdException w:name="Light Shading Accent 2" w:semiHidden="0" w:uiPriority="60" w:unhideWhenUsed="0"/>
-    <w:lsdException w:name="Light List Accent 2" w:semiHidden="0" w:uiPriority="61" w:unhideWhenUsed="0"/>
-    <w:lsdException w:name="Light Grid Accent 2" w:semiHidden="0" w:uiPriority="62" w:unhideWhenUsed="0"/>
-    <w:lsdException w:name="Medium Shading 1 Accent 2" w:semiHidden="0" w:uiPriority="63" w:unhideWhenUsed="0"/>
-    <w:lsdException w:name="Medium Shading 2 Accent 2" w:semiHidden="0" w:uiPriority="64" w:unhideWhenUsed="0"/>
-    <w:lsdException w:name="Medium List 1 Accent 2" w:semiHidden="0" w:uiPriority="65" w:unhideWhenUsed="0"/>
-    <w:lsdException w:name="Medium List 2 Accent 2" w:semiHidden="0" w:uiPriority="66" w:unhideWhenUsed="0"/>
-    <w:lsdException w:name="Medium Grid 1 Accent 2" w:semiHidden="0" w:uiPriority="67" w:unhideWhenUsed="0"/>
-    <w:lsdException w:name="Medium Grid 2 Accent 2" w:semiHidden="0" w:uiPriority="68" w:unhideWhenUsed="0"/>
-    <w:lsdException w:name="Medium Grid 3 Accent 2" w:semiHidden="0" w:uiPriority="69" w:unhideWhenUsed="0"/>
-    <w:lsdException w:name="Dark List Accent 2" w:semiHidden="0" w:uiPriority="70" w:unhideWhenUsed="0"/>
-    <w:lsdException w:name="Colorful Shading Accent 2" w:semiHidden="0" w:uiPriority="71" w:unhideWhenUsed="0"/>
-    <w:lsdException w:name="Colorful List Accent 2" w:semiHidden="0" w:uiPriority="72" w:unhideWhenUsed="0"/>
-    <w:lsdException w:name="Colorful Grid Accent 2" w:semiHidden="0" w:uiPriority="73" w:unhideWhenUsed="0"/>
-    <w:lsdException w:name="Light Shading Accent 3" w:semiHidden="0" w:uiPriority="60" w:unhideWhenUsed="0"/>
-    <w:lsdException w:name="Light List Accent 3" w:semiHidden="0" w:uiPriority="61" w:unhideWhenUsed="0"/>
-    <w:lsdException w:name="Light Grid Accent 3" w:semiHidden="0" w:uiPriority="62" w:unhideWhenUsed="0"/>
-    <w:lsdException w:name="Medium Shading 1 Accent 3" w:semiHidden="0" w:uiPriority="63" w:unhideWhenUsed="0"/>
-    <w:lsdException w:name="Medium Shading 2 Accent 3" w:semiHidden="0" w:uiPriority="64" w:unhideWhenUsed="0"/>
-    <w:lsdException w:name="Medium List 1 Accent 3" w:semiHidden="0" w:uiPriority="65" w:unhideWhenUsed="0"/>
-    <w:lsdException w:name="Medium List 2 Accent 3" w:semiHidden="0" w:uiPriority="66" w:unhideWhenUsed="0"/>
-    <w:lsdException w:name="Medium Grid 1 Accent 3" w:semiHidden="0" w:uiPriority="67" w:unhideWhenUsed="0"/>
-    <w:lsdException w:name="Medium Grid 2 Accent 3" w:semiHidden="0" w:uiPriority="68" w:unhideWhenUsed="0"/>
-    <w:lsdException w:name="Medium Grid 3 Accent 3" w:semiHidden="0" w:uiPriority="69" w:unhideWhenUsed="0"/>
-    <w:lsdException w:name="Dark List Accent 3" w:semiHidden="0" w:uiPriority="70" w:unhideWhenUsed="0"/>
-    <w:lsdException w:name="Colorful Shading Accent 3" w:semiHidden="0" w:uiPriority="71" w:unhideWhenUsed="0"/>
-    <w:lsdException w:name="Colorful List Accent 3" w:semiHidden="0" w:uiPriority="72" w:unhideWhenUsed="0"/>
-    <w:lsdException w:name="Colorful Grid Accent 3" w:semiHidden="0" w:uiPriority="73" w:unhideWhenUsed="0"/>
-    <w:lsdException w:name="Light Shading Accent 4" w:semiHidden="0" w:uiPriority="60" w:unhideWhenUsed="0"/>
-    <w:lsdException w:name="Light List Accent 4" w:semiHidden="0" w:uiPriority="61" w:unhideWhenUsed="0"/>
-    <w:lsdException w:name="Light Grid Accent 4" w:semiHidden="0" w:uiPriority="62" w:unhideWhenUsed="0"/>
-    <w:lsdException w:name="Medium Shading 1 Accent 4" w:semiHidden="0" w:uiPriority="63" w:unhideWhenUsed="0"/>
-    <w:lsdException w:name="Medium Shading 2 Accent 4" w:semiHidden="0" w:uiPriority="64" w:unhideWhenUsed="0"/>
-    <w:lsdException w:name="Medium List 1 Accent 4" w:semiHidden="0" w:uiPriority="65" w:unhideWhenUsed="0"/>
-    <w:lsdException w:name="Medium List 2 Accent 4" w:semiHidden="0" w:uiPriority="66" w:unhideWhenUsed="0"/>
-    <w:lsdException w:name="Medium Grid 1 Accent 4" w:semiHidden="0" w:uiPriority="67" w:unhideWhenUsed="0"/>
-    <w:lsdException w:name="Medium Grid 2 Accent 4" w:semiHidden="0" w:uiPriority="68" w:unhideWhenUsed="0"/>
-    <w:lsdException w:name="Medium Grid 3 Accent 4" w:semiHidden="0" w:uiPriority="69" w:unhideWhenUsed="0"/>
-    <w:lsdException w:name="Dark List Accent 4" w:semiHidden="0" w:uiPriority="70" w:unhideWhenUsed="0"/>
-    <w:lsdException w:name="Colorful Shading Accent 4" w:semiHidden="0" w:uiPriority="71" w:unhideWhenUsed="0"/>
-    <w:lsdException w:name="Colorful List Accent 4" w:semiHidden="0" w:uiPriority="72" w:unhideWhenUsed="0"/>
-    <w:lsdException w:name="Colorful Grid Accent 4" w:semiHidden="0" w:uiPriority="73" w:unhideWhenUsed="0"/>
-    <w:lsdException w:name="Light Shading Accent 5" w:semiHidden="0" w:uiPriority="60" w:unhideWhenUsed="0"/>
-    <w:lsdException w:name="Light List Accent 5" w:semiHidden="0" w:uiPriority="61" w:unhideWhenUsed="0"/>
-    <w:lsdException w:name="Light Grid Accent 5" w:semiHidden="0" w:uiPriority="62" w:unhideWhenUsed="0"/>
-    <w:lsdException w:name="Medium Shading 1 Accent 5" w:semiHidden="0" w:uiPriority="63" w:unhideWhenUsed="0"/>
-    <w:lsdException w:name="Medium Shading 2 Accent 5" w:semiHidden="0" w:uiPriority="64" w:unhideWhenUsed="0"/>
-    <w:lsdException w:name="Medium List 1 Accent 5" w:semiHidden="0" w:uiPriority="65" w:unhideWhenUsed="0"/>
-    <w:lsdException w:name="Medium List 2 Accent 5" w:semiHidden="0" w:uiPriority="66" w:unhideWhenUsed="0"/>
-    <w:lsdException w:name="Medium Grid 1 Accent 5" w:semiHidden="0" w:uiPriority="67" w:unhideWhenUsed="0"/>
-    <w:lsdException w:name="Medium Grid 2 Accent 5" w:semiHidden="0" w:uiPriority="68" w:unhideWhenUsed="0"/>
-    <w:lsdException w:name="Medium Grid 3 Accent 5" w:semiHidden="0" w:uiPriority="69" w:unhideWhenUsed="0"/>
-    <w:lsdException w:name="Dark List Accent 5" w:semiHidden="0" w:uiPriority="70" w:unhideWhenUsed="0"/>
-    <w:lsdException w:name="Colorful Shading Accent 5" w:semiHidden="0" w:uiPriority="71" w:unhideWhenUsed="0"/>
-    <w:lsdException w:name="Colorful List Accent 5" w:semiHidden="0" w:uiPriority="72" w:unhideWhenUsed="0"/>
-    <w:lsdException w:name="Colorful Grid Accent 5" w:semiHidden="0" w:uiPriority="73" w:unhideWhenUsed="0"/>
-    <w:lsdException w:name="Light Shading Accent 6" w:semiHidden="0" w:uiPriority="60" w:unhideWhenUsed="0"/>
-    <w:lsdException w:name="Light List Accent 6" w:semiHidden="0" w:uiPriority="61" w:unhideWhenUsed="0"/>
-    <w:lsdException w:name="Light Grid Accent 6" w:semiHidden="0" w:uiPriority="62" w:unhideWhenUsed="0"/>
-    <w:lsdException w:name="Medium Shading 1 Accent 6" w:semiHidden="0" w:uiPriority="63" w:unhideWhenUsed="0"/>
-    <w:lsdException w:name="Medium Shading 2 Accent 6" w:semiHidden="0" w:uiPriority="64" w:unhideWhenUsed="0"/>
-    <w:lsdException w:name="Medium List 1 Accent 6" w:semiHidden="0" w:uiPriority="65" w:unhideWhenUsed="0"/>
-    <w:lsdException w:name="Medium List 2 Accent 6" w:semiHidden="0" w:uiPriority="66" w:unhideWhenUsed="0"/>
-    <w:lsdException w:name="Medium Grid 1 Accent 6" w:semiHidden="0" w:uiPriority="67" w:unhideWhenUsed="0"/>
-    <w:lsdException w:name="Medium Grid 2 Accent 6" w:semiHidden="0" w:uiPriority="68" w:unhideWhenUsed="0"/>
-    <w:lsdException w:name="Medium Grid 3 Accent 6" w:semiHidden="0" w:uiPriority="69" w:unhideWhenUsed="0"/>
-    <w:lsdException w:name="Dark List Accent 6" w:semiHidden="0" w:uiPriority="70" w:unhideWhenUsed="0"/>
-    <w:lsdException w:name="Colorful Shading Accent 6" w:semiHidden="0" w:uiPriority="71" w:unhideWhenUsed="0"/>
-    <w:lsdException w:name="Colorful List Accent 6" w:semiHidden="0" w:uiPriority="72" w:unhideWhenUsed="0"/>
-    <w:lsdException w:name="Colorful Grid Accent 6" w:semiHidden="0" w:uiPriority="73" w:unhideWhenUsed="0"/>
-    <w:lsdException w:name="Subtle Emphasis" w:semiHidden="0" w:uiPriority="19" w:unhideWhenUsed="0" w:qFormat="1"/>
-    <w:lsdException w:name="Intense Emphasis" w:semiHidden="0" w:uiPriority="21" w:unhideWhenUsed="0" w:qFormat="1"/>
-    <w:lsdException w:name="Subtle Reference" w:semiHidden="0" w:uiPriority="31" w:unhideWhenUsed="0" w:qFormat="1"/>
-    <w:lsdException w:name="Intense Reference" w:semiHidden="0" w:uiPriority="32" w:unhideWhenUsed="0" w:qFormat="1"/>
-    <w:lsdException w:name="Book Title" w:semiHidden="0" w:uiPriority="33" w:unhideWhenUsed="0" w:qFormat="1"/>
-    <w:lsdException w:name="Bibliography" w:uiPriority="37"/>
-    <w:lsdException w:name="TOC Heading" w:uiPriority="39" w:qFormat="1"/>
+  <w:latentStyles w:defLockedState="0" w:defUIPriority="99" w:defSemiHidden="0" w:defUnhideWhenUsed="0" w:defQFormat="0" w:count="376">
+    <w:lsdException w:name="Normal" w:uiPriority="0" w:qFormat="1"/>
+    <w:lsdException w:name="heading 1" w:uiPriority="9" w:qFormat="1"/>
+    <w:lsdException w:name="heading 2" w:semiHidden="1" w:uiPriority="9" w:unhideWhenUsed="1" w:qFormat="1"/>
+    <w:lsdException w:name="heading 3" w:semiHidden="1" w:uiPriority="9" w:unhideWhenUsed="1" w:qFormat="1"/>
+    <w:lsdException w:name="heading 4" w:semiHidden="1" w:uiPriority="9" w:unhideWhenUsed="1" w:qFormat="1"/>
+    <w:lsdException w:name="heading 5" w:semiHidden="1" w:uiPriority="9" w:unhideWhenUsed="1" w:qFormat="1"/>
+    <w:lsdException w:name="heading 6" w:semiHidden="1" w:uiPriority="9" w:unhideWhenUsed="1" w:qFormat="1"/>
+    <w:lsdException w:name="heading 7" w:semiHidden="1" w:uiPriority="9" w:unhideWhenUsed="1" w:qFormat="1"/>
+    <w:lsdException w:name="heading 8" w:semiHidden="1" w:uiPriority="9" w:unhideWhenUsed="1" w:qFormat="1"/>
+    <w:lsdException w:name="heading 9" w:semiHidden="1" w:uiPriority="9" w:unhideWhenUsed="1" w:qFormat="1"/>
+    <w:lsdException w:name="index 1" w:semiHidden="1" w:unhideWhenUsed="1"/>
+    <w:lsdException w:name="index 2" w:semiHidden="1" w:unhideWhenUsed="1"/>
+    <w:lsdException w:name="index 3" w:semiHidden="1" w:unhideWhenUsed="1"/>
+    <w:lsdException w:name="index 4" w:semiHidden="1" w:unhideWhenUsed="1"/>
+    <w:lsdException w:name="index 5" w:semiHidden="1" w:unhideWhenUsed="1"/>
+    <w:lsdException w:name="index 6" w:semiHidden="1" w:unhideWhenUsed="1"/>
+    <w:lsdException w:name="index 7" w:semiHidden="1" w:unhideWhenUsed="1"/>
+    <w:lsdException w:name="index 8" w:semiHidden="1" w:unhideWhenUsed="1"/>
+    <w:lsdException w:name="index 9" w:semiHidden="1" w:unhideWhenUsed="1"/>
+    <w:lsdException w:name="toc 1" w:semiHidden="1" w:uiPriority="39" w:unhideWhenUsed="1"/>
+    <w:lsdException w:name="toc 2" w:semiHidden="1" w:uiPriority="39" w:unhideWhenUsed="1"/>
+    <w:lsdException w:name="toc 3" w:semiHidden="1" w:uiPriority="39" w:unhideWhenUsed="1"/>
+    <w:lsdException w:name="toc 4" w:semiHidden="1" w:uiPriority="39" w:unhideWhenUsed="1"/>
+    <w:lsdException w:name="toc 5" w:semiHidden="1" w:uiPriority="39" w:unhideWhenUsed="1"/>
+    <w:lsdException w:name="toc 6" w:semiHidden="1" w:uiPriority="39" w:unhideWhenUsed="1"/>
+    <w:lsdException w:name="toc 7" w:semiHidden="1" w:uiPriority="39" w:unhideWhenUsed="1"/>
+    <w:lsdException w:name="toc 8" w:semiHidden="1" w:uiPriority="39" w:unhideWhenUsed="1"/>
+    <w:lsdException w:name="toc 9" w:semiHidden="1" w:uiPriority="39" w:unhideWhenUsed="1"/>
+    <w:lsdException w:name="Normal Indent" w:semiHidden="1" w:unhideWhenUsed="1"/>
+    <w:lsdException w:name="footnote text" w:semiHidden="1" w:unhideWhenUsed="1"/>
+    <w:lsdException w:name="annotation text" w:semiHidden="1" w:unhideWhenUsed="1"/>
+    <w:lsdException w:name="header" w:semiHidden="1" w:unhideWhenUsed="1"/>
+    <w:lsdException w:name="footer" w:semiHidden="1" w:unhideWhenUsed="1"/>
+    <w:lsdException w:name="index heading" w:semiHidden="1" w:unhideWhenUsed="1"/>
+    <w:lsdException w:name="caption" w:semiHidden="1" w:uiPriority="35" w:unhideWhenUsed="1" w:qFormat="1"/>
+    <w:lsdException w:name="table of figures" w:semiHidden="1" w:unhideWhenUsed="1"/>
+    <w:lsdException w:name="envelope address" w:semiHidden="1" w:unhideWhenUsed="1"/>
+    <w:lsdException w:name="envelope return" w:semiHidden="1" w:unhideWhenUsed="1"/>
+    <w:lsdException w:name="footnote reference" w:semiHidden="1" w:unhideWhenUsed="1"/>
+    <w:lsdException w:name="annotation reference" w:semiHidden="1" w:unhideWhenUsed="1"/>
+    <w:lsdException w:name="line number" w:semiHidden="1" w:unhideWhenUsed="1"/>
+    <w:lsdException w:name="page number" w:semiHidden="1" w:unhideWhenUsed="1"/>
+    <w:lsdException w:name="endnote reference" w:semiHidden="1" w:unhideWhenUsed="1"/>
+    <w:lsdException w:name="endnote text" w:semiHidden="1" w:unhideWhenUsed="1"/>
+    <w:lsdException w:name="table of authorities" w:semiHidden="1" w:unhideWhenUsed="1"/>
+    <w:lsdException w:name="macro" w:semiHidden="1" w:unhideWhenUsed="1"/>
+    <w:lsdException w:name="toa heading" w:semiHidden="1" w:unhideWhenUsed="1"/>
+    <w:lsdException w:name="List" w:semiHidden="1" w:unhideWhenUsed="1"/>
+    <w:lsdException w:name="List Bullet" w:semiHidden="1" w:unhideWhenUsed="1"/>
+    <w:lsdException w:name="List Number" w:semiHidden="1" w:unhideWhenUsed="1"/>
+    <w:lsdException w:name="List 2" w:semiHidden="1" w:unhideWhenUsed="1"/>
+    <w:lsdException w:name="List 3" w:semiHidden="1" w:unhideWhenUsed="1"/>
+    <w:lsdException w:name="List 4" w:semiHidden="1" w:unhideWhenUsed="1"/>
+    <w:lsdException w:name="List 5" w:semiHidden="1" w:unhideWhenUsed="1"/>
+    <w:lsdException w:name="List Bullet 2" w:semiHidden="1" w:unhideWhenUsed="1"/>
+    <w:lsdException w:name="List Bullet 3" w:semiHidden="1" w:unhideWhenUsed="1"/>
+    <w:lsdException w:name="List Bullet 4" w:semiHidden="1" w:unhideWhenUsed="1"/>
+    <w:lsdException w:name="List Bullet 5" w:semiHidden="1" w:unhideWhenUsed="1"/>
+    <w:lsdException w:name="List Number 2" w:semiHidden="1" w:unhideWhenUsed="1"/>
+    <w:lsdException w:name="List Number 3" w:semiHidden="1" w:unhideWhenUsed="1"/>
+    <w:lsdException w:name="List Number 4" w:semiHidden="1" w:unhideWhenUsed="1"/>
+    <w:lsdException w:name="List Number 5" w:semiHidden="1" w:unhideWhenUsed="1"/>
+    <w:lsdException w:name="Title" w:uiPriority="10" w:qFormat="1"/>
+    <w:lsdException w:name="Closing" w:semiHidden="1" w:unhideWhenUsed="1"/>
+    <w:lsdException w:name="Signature" w:semiHidden="1" w:unhideWhenUsed="1"/>
+    <w:lsdException w:name="Default Paragraph Font" w:semiHidden="1" w:uiPriority="1" w:unhideWhenUsed="1"/>
+    <w:lsdException w:name="Body Text" w:semiHidden="1" w:unhideWhenUsed="1"/>
+    <w:lsdException w:name="Body Text Indent" w:semiHidden="1" w:unhideWhenUsed="1"/>
+    <w:lsdException w:name="List Continue" w:semiHidden="1" w:unhideWhenUsed="1"/>
+    <w:lsdException w:name="List Continue 2" w:semiHidden="1" w:unhideWhenUsed="1"/>
+    <w:lsdException w:name="List Continue 3" w:semiHidden="1" w:unhideWhenUsed="1"/>
+    <w:lsdException w:name="List Continue 4" w:semiHidden="1" w:unhideWhenUsed="1"/>
+    <w:lsdException w:name="List Continue 5" w:semiHidden="1" w:unhideWhenUsed="1"/>
+    <w:lsdException w:name="Message Header" w:semiHidden="1" w:unhideWhenUsed="1"/>
+    <w:lsdException w:name="Subtitle" w:uiPriority="11" w:qFormat="1"/>
+    <w:lsdException w:name="Salutation" w:semiHidden="1" w:unhideWhenUsed="1"/>
+    <w:lsdException w:name="Date" w:semiHidden="1" w:unhideWhenUsed="1"/>
+    <w:lsdException w:name="Body Text First Indent" w:semiHidden="1" w:unhideWhenUsed="1"/>
+    <w:lsdException w:name="Body Text First Indent 2" w:semiHidden="1" w:unhideWhenUsed="1"/>
+    <w:lsdException w:name="Note Heading" w:semiHidden="1" w:unhideWhenUsed="1"/>
+    <w:lsdException w:name="Body Text 2" w:semiHidden="1" w:unhideWhenUsed="1"/>
+    <w:lsdException w:name="Body Text 3" w:semiHidden="1" w:unhideWhenUsed="1"/>
+    <w:lsdException w:name="Body Text Indent 2" w:semiHidden="1" w:unhideWhenUsed="1"/>
+    <w:lsdException w:name="Body Text Indent 3" w:semiHidden="1" w:unhideWhenUsed="1"/>
+    <w:lsdException w:name="Block Text" w:semiHidden="1" w:unhideWhenUsed="1"/>
+    <w:lsdException w:name="Hyperlink" w:semiHidden="1" w:unhideWhenUsed="1"/>
+    <w:lsdException w:name="FollowedHyperlink" w:semiHidden="1" w:unhideWhenUsed="1"/>
+    <w:lsdException w:name="Strong" w:uiPriority="22" w:qFormat="1"/>
+    <w:lsdException w:name="Emphasis" w:uiPriority="20" w:qFormat="1"/>
+    <w:lsdException w:name="Document Map" w:semiHidden="1" w:unhideWhenUsed="1"/>
+    <w:lsdException w:name="Plain Text" w:semiHidden="1" w:unhideWhenUsed="1"/>
+    <w:lsdException w:name="E-mail Signature" w:semiHidden="1" w:unhideWhenUsed="1"/>
+    <w:lsdException w:name="HTML Top of Form" w:semiHidden="1" w:unhideWhenUsed="1"/>
+    <w:lsdException w:name="HTML Bottom of Form" w:semiHidden="1" w:unhideWhenUsed="1"/>
+    <w:lsdException w:name="Normal (Web)" w:semiHidden="1" w:unhideWhenUsed="1"/>
+    <w:lsdException w:name="HTML Acronym" w:semiHidden="1" w:unhideWhenUsed="1"/>
+    <w:lsdException w:name="HTML Address" w:semiHidden="1" w:unhideWhenUsed="1"/>
+    <w:lsdException w:name="HTML Cite" w:semiHidden="1" w:unhideWhenUsed="1"/>
+    <w:lsdException w:name="HTML Code" w:semiHidden="1" w:unhideWhenUsed="1"/>
+    <w:lsdException w:name="HTML Definition" w:semiHidden="1" w:unhideWhenUsed="1"/>
+    <w:lsdException w:name="HTML Keyboard" w:semiHidden="1" w:unhideWhenUsed="1"/>
+    <w:lsdException w:name="HTML Preformatted" w:semiHidden="1" w:unhideWhenUsed="1"/>
+    <w:lsdException w:name="HTML Sample" w:semiHidden="1" w:unhideWhenUsed="1"/>
+    <w:lsdException w:name="HTML Typewriter" w:semiHidden="1" w:unhideWhenUsed="1"/>
+    <w:lsdException w:name="HTML Variable" w:semiHidden="1" w:unhideWhenUsed="1"/>
+    <w:lsdException w:name="Normal Table" w:semiHidden="1" w:unhideWhenUsed="1"/>
+    <w:lsdException w:name="annotation subject" w:semiHidden="1" w:unhideWhenUsed="1"/>
+    <w:lsdException w:name="No List" w:semiHidden="1" w:unhideWhenUsed="1"/>
+    <w:lsdException w:name="Outline List 1" w:semiHidden="1" w:unhideWhenUsed="1"/>
+    <w:lsdException w:name="Outline List 2" w:semiHidden="1" w:unhideWhenUsed="1"/>
+    <w:lsdException w:name="Outline List 3" w:semiHidden="1" w:unhideWhenUsed="1"/>
+    <w:lsdException w:name="Table Simple 1" w:semiHidden="1" w:unhideWhenUsed="1"/>
+    <w:lsdException w:name="Table Simple 2" w:semiHidden="1" w:unhideWhenUsed="1"/>
+    <w:lsdException w:name="Table Simple 3" w:semiHidden="1" w:unhideWhenUsed="1"/>
+    <w:lsdException w:name="Table Classic 1" w:semiHidden="1" w:unhideWhenUsed="1"/>
+    <w:lsdException w:name="Table Classic 2" w:semiHidden="1" w:unhideWhenUsed="1"/>
+    <w:lsdException w:name="Table Classic 3" w:semiHidden="1" w:unhideWhenUsed="1"/>
+    <w:lsdException w:name="Table Classic 4" w:semiHidden="1" w:unhideWhenUsed="1"/>
+    <w:lsdException w:name="Table Colorful 1" w:semiHidden="1" w:unhideWhenUsed="1"/>
+    <w:lsdException w:name="Table Colorful 2" w:semiHidden="1" w:unhideWhenUsed="1"/>
+    <w:lsdException w:name="Table Colorful 3" w:semiHidden="1" w:unhideWhenUsed="1"/>
+    <w:lsdException w:name="Table Columns 1" w:semiHidden="1" w:unhideWhenUsed="1"/>
+    <w:lsdException w:name="Table Columns 2" w:semiHidden="1" w:unhideWhenUsed="1"/>
+    <w:lsdException w:name="Table Columns 3" w:semiHidden="1" w:unhideWhenUsed="1"/>
+    <w:lsdException w:name="Table Columns 4" w:semiHidden="1" w:unhideWhenUsed="1"/>
+    <w:lsdException w:name="Table Columns 5" w:semiHidden="1" w:unhideWhenUsed="1"/>
+    <w:lsdException w:name="Table Grid 1" w:semiHidden="1" w:unhideWhenUsed="1"/>
+    <w:lsdException w:name="Table Grid 2" w:semiHidden="1" w:unhideWhenUsed="1"/>
+    <w:lsdException w:name="Table Grid 3" w:semiHidden="1" w:unhideWhenUsed="1"/>
+    <w:lsdException w:name="Table Grid 4" w:semiHidden="1" w:unhideWhenUsed="1"/>
+    <w:lsdException w:name="Table Grid 5" w:semiHidden="1" w:unhideWhenUsed="1"/>
+    <w:lsdException w:name="Table Grid 6" w:semiHidden="1" w:unhideWhenUsed="1"/>
+    <w:lsdException w:name="Table Grid 7" w:semiHidden="1" w:unhideWhenUsed="1"/>
+    <w:lsdException w:name="Table Grid 8" w:semiHidden="1" w:unhideWhenUsed="1"/>
+    <w:lsdException w:name="Table List 1" w:semiHidden="1" w:unhideWhenUsed="1"/>
+    <w:lsdException w:name="Table List 2" w:semiHidden="1" w:unhideWhenUsed="1"/>
+    <w:lsdException w:name="Table List 3" w:semiHidden="1" w:unhideWhenUsed="1"/>
+    <w:lsdException w:name="Table List 4" w:semiHidden="1" w:unhideWhenUsed="1"/>
+    <w:lsdException w:name="Table List 5" w:semiHidden="1" w:unhideWhenUsed="1"/>
+    <w:lsdException w:name="Table List 6" w:semiHidden="1" w:unhideWhenUsed="1"/>
+    <w:lsdException w:name="Table List 7" w:semiHidden="1" w:unhideWhenUsed="1"/>
+    <w:lsdException w:name="Table List 8" w:semiHidden="1" w:unhideWhenUsed="1"/>
+    <w:lsdException w:name="Table 3D effects 1" w:semiHidden="1" w:unhideWhenUsed="1"/>
+    <w:lsdException w:name="Table 3D effects 2" w:semiHidden="1" w:unhideWhenUsed="1"/>
+    <w:lsdException w:name="Table 3D effects 3" w:semiHidden="1" w:unhideWhenUsed="1"/>
+    <w:lsdException w:name="Table Contemporary" w:semiHidden="1" w:unhideWhenUsed="1"/>
+    <w:lsdException w:name="Table Elegant" w:semiHidden="1" w:unhideWhenUsed="1"/>
+    <w:lsdException w:name="Table Professional" w:semiHidden="1" w:unhideWhenUsed="1"/>
+    <w:lsdException w:name="Table Subtle 1" w:semiHidden="1" w:unhideWhenUsed="1"/>
+    <w:lsdException w:name="Table Subtle 2" w:semiHidden="1" w:unhideWhenUsed="1"/>
+    <w:lsdException w:name="Table Web 1" w:semiHidden="1" w:unhideWhenUsed="1"/>
+    <w:lsdException w:name="Table Web 2" w:semiHidden="1" w:unhideWhenUsed="1"/>
+    <w:lsdException w:name="Table Web 3" w:semiHidden="1" w:unhideWhenUsed="1"/>
+    <w:lsdException w:name="Balloon Text" w:semiHidden="1" w:unhideWhenUsed="1"/>
+    <w:lsdException w:name="Table Grid" w:uiPriority="59"/>
+    <w:lsdException w:name="Table Theme" w:semiHidden="1" w:unhideWhenUsed="1"/>
+    <w:lsdException w:name="Placeholder Text" w:semiHidden="1"/>
+    <w:lsdException w:name="No Spacing" w:uiPriority="1" w:qFormat="1"/>
+    <w:lsdException w:name="Light Shading" w:uiPriority="60"/>
+    <w:lsdException w:name="Light List" w:uiPriority="61"/>
+    <w:lsdException w:name="Light Grid" w:uiPriority="62"/>
+    <w:lsdException w:name="Medium Shading 1" w:uiPriority="63"/>
+    <w:lsdException w:name="Medium Shading 2" w:uiPriority="64"/>
+    <w:lsdException w:name="Medium List 1" w:uiPriority="65"/>
+    <w:lsdException w:name="Medium List 2" w:uiPriority="66"/>
+    <w:lsdException w:name="Medium Grid 1" w:uiPriority="67"/>
+    <w:lsdException w:name="Medium Grid 2" w:uiPriority="68"/>
+    <w:lsdException w:name="Medium Grid 3" w:uiPriority="69"/>
+    <w:lsdException w:name="Dark List" w:uiPriority="70"/>
+    <w:lsdException w:name="Colorful Shading" w:uiPriority="71"/>
+    <w:lsdException w:name="Colorful List" w:uiPriority="72"/>
+    <w:lsdException w:name="Colorful Grid" w:uiPriority="73"/>
+    <w:lsdException w:name="Light Shading Accent 1" w:uiPriority="60"/>
+    <w:lsdException w:name="Light List Accent 1" w:uiPriority="61"/>
+    <w:lsdException w:name="Light Grid Accent 1" w:uiPriority="62"/>
+    <w:lsdException w:name="Medium Shading 1 Accent 1" w:uiPriority="63"/>
+    <w:lsdException w:name="Medium Shading 2 Accent 1" w:uiPriority="64"/>
+    <w:lsdException w:name="Medium List 1 Accent 1" w:uiPriority="65"/>
+    <w:lsdException w:name="Revision" w:semiHidden="1"/>
+    <w:lsdException w:name="List Paragraph" w:uiPriority="34" w:qFormat="1"/>
+    <w:lsdException w:name="Quote" w:uiPriority="29" w:qFormat="1"/>
+    <w:lsdException w:name="Intense Quote" w:uiPriority="30" w:qFormat="1"/>
+    <w:lsdException w:name="Medium List 2 Accent 1" w:uiPriority="66"/>
+    <w:lsdException w:name="Medium Grid 1 Accent 1" w:uiPriority="67"/>
+    <w:lsdException w:name="Medium Grid 2 Accent 1" w:uiPriority="68"/>
+    <w:lsdException w:name="Medium Grid 3 Accent 1" w:uiPriority="69"/>
+    <w:lsdException w:name="Dark List Accent 1" w:uiPriority="70"/>
+    <w:lsdException w:name="Colorful Shading Accent 1" w:uiPriority="71"/>
+    <w:lsdException w:name="Colorful List Accent 1" w:uiPriority="72"/>
+    <w:lsdException w:name="Colorful Grid Accent 1" w:uiPriority="73"/>
+    <w:lsdException w:name="Light Shading Accent 2" w:uiPriority="60"/>
+    <w:lsdException w:name="Light List Accent 2" w:uiPriority="61"/>
+    <w:lsdException w:name="Light Grid Accent 2" w:uiPriority="62"/>
+    <w:lsdException w:name="Medium Shading 1 Accent 2" w:uiPriority="63"/>
+    <w:lsdException w:name="Medium Shading 2 Accent 2" w:uiPriority="64"/>
+    <w:lsdException w:name="Medium List 1 Accent 2" w:uiPriority="65"/>
+    <w:lsdException w:name="Medium List 2 Accent 2" w:uiPriority="66"/>
+    <w:lsdException w:name="Medium Grid 1 Accent 2" w:uiPriority="67"/>
+    <w:lsdException w:name="Medium Grid 2 Accent 2" w:uiPriority="68"/>
+    <w:lsdException w:name="Medium Grid 3 Accent 2" w:uiPriority="69"/>
+    <w:lsdException w:name="Dark List Accent 2" w:uiPriority="70"/>
+    <w:lsdException w:name="Colorful Shading Accent 2" w:uiPriority="71"/>
+    <w:lsdException w:name="Colorful List Accent 2" w:uiPriority="72"/>
+    <w:lsdException w:name="Colorful Grid Accent 2" w:uiPriority="73"/>
+    <w:lsdException w:name="Light Shading Accent 3" w:uiPriority="60"/>
+    <w:lsdException w:name="Light List Accent 3" w:uiPriority="61"/>
+    <w:lsdException w:name="Light Grid Accent 3" w:uiPriority="62"/>
+    <w:lsdException w:name="Medium Shading 1 Accent 3" w:uiPriority="63"/>
+    <w:lsdException w:name="Medium Shading 2 Accent 3" w:uiPriority="64"/>
+    <w:lsdException w:name="Medium List 1 Accent 3" w:uiPriority="65"/>
+    <w:lsdException w:name="Medium List 2 Accent 3" w:uiPriority="66"/>
+    <w:lsdException w:name="Medium Grid 1 Accent 3" w:uiPriority="67"/>
+    <w:lsdException w:name="Medium Grid 2 Accent 3" w:uiPriority="68"/>
+    <w:lsdException w:name="Medium Grid 3 Accent 3" w:uiPriority="69"/>
+    <w:lsdException w:name="Dark List Accent 3" w:uiPriority="70"/>
+    <w:lsdException w:name="Colorful Shading Accent 3" w:uiPriority="71"/>
+    <w:lsdException w:name="Colorful List Accent 3" w:uiPriority="72"/>
+    <w:lsdException w:name="Colorful Grid Accent 3" w:uiPriority="73"/>
+    <w:lsdException w:name="Light Shading Accent 4" w:uiPriority="60"/>
+    <w:lsdException w:name="Light List Accent 4" w:uiPriority="61"/>
+    <w:lsdException w:name="Light Grid Accent 4" w:uiPriority="62"/>
+    <w:lsdException w:name="Medium Shading 1 Accent 4" w:uiPriority="63"/>
+    <w:lsdException w:name="Medium Shading 2 Accent 4" w:uiPriority="64"/>
+    <w:lsdException w:name="Medium List 1 Accent 4" w:uiPriority="65"/>
+    <w:lsdException w:name="Medium List 2 Accent 4" w:uiPriority="66"/>
+    <w:lsdException w:name="Medium Grid 1 Accent 4" w:uiPriority="67"/>
+    <w:lsdException w:name="Medium Grid 2 Accent 4" w:uiPriority="68"/>
+    <w:lsdException w:name="Medium Grid 3 Accent 4" w:uiPriority="69"/>
+    <w:lsdException w:name="Dark List Accent 4" w:uiPriority="70"/>
+    <w:lsdException w:name="Colorful Shading Accent 4" w:uiPriority="71"/>
+    <w:lsdException w:name="Colorful List Accent 4" w:uiPriority="72"/>
+    <w:lsdException w:name="Colorful Grid Accent 4" w:uiPriority="73"/>
+    <w:lsdException w:name="Light Shading Accent 5" w:uiPriority="60"/>
+    <w:lsdException w:name="Light List Accent 5" w:uiPriority="61"/>
+    <w:lsdException w:name="Light Grid Accent 5" w:uiPriority="62"/>
+    <w:lsdException w:name="Medium Shading 1 Accent 5" w:uiPriority="63"/>
+    <w:lsdException w:name="Medium Shading 2 Accent 5" w:uiPriority="64"/>
+    <w:lsdException w:name="Medium List 1 Accent 5" w:uiPriority="65"/>
+    <w:lsdException w:name="Medium List 2 Accent 5" w:uiPriority="66"/>
+    <w:lsdException w:name="Medium Grid 1 Accent 5" w:uiPriority="67"/>
+    <w:lsdException w:name="Medium Grid 2 Accent 5" w:uiPriority="68"/>
+    <w:lsdException w:name="Medium Grid 3 Accent 5" w:uiPriority="69"/>
+    <w:lsdException w:name="Dark List Accent 5" w:uiPriority="70"/>
+    <w:lsdException w:name="Colorful Shading Accent 5" w:uiPriority="71"/>
+    <w:lsdException w:name="Colorful List Accent 5" w:uiPriority="72"/>
+    <w:lsdException w:name="Colorful Grid Accent 5" w:uiPriority="73"/>
+    <w:lsdException w:name="Light Shading Accent 6" w:uiPriority="60"/>
+    <w:lsdException w:name="Light List Accent 6" w:uiPriority="61"/>
+    <w:lsdException w:name="Light Grid Accent 6" w:uiPriority="62"/>
+    <w:lsdException w:name="Medium Shading 1 Accent 6" w:uiPriority="63"/>
+    <w:lsdException w:name="Medium Shading 2 Accent 6" w:uiPriority="64"/>
+    <w:lsdException w:name="Medium List 1 Accent 6" w:uiPriority="65"/>
+    <w:lsdException w:name="Medium List 2 Accent 6" w:uiPriority="66"/>
+    <w:lsdException w:name="Medium Grid 1 Accent 6" w:uiPriority="67"/>
+    <w:lsdException w:name="Medium Grid 2 Accent 6" w:uiPriority="68"/>
+    <w:lsdException w:name="Medium Grid 3 Accent 6" w:uiPriority="69"/>
+    <w:lsdException w:name="Dark List Accent 6" w:uiPriority="70"/>
+    <w:lsdException w:name="Colorful Shading Accent 6" w:uiPriority="71"/>
+    <w:lsdException w:name="Colorful List Accent 6" w:uiPriority="72"/>
+    <w:lsdException w:name="Colorful Grid Accent 6" w:uiPriority="73"/>
+    <w:lsdException w:name="Subtle Emphasis" w:uiPriority="19" w:qFormat="1"/>
+    <w:lsdException w:name="Intense Emphasis" w:uiPriority="21" w:qFormat="1"/>
+    <w:lsdException w:name="Subtle Reference" w:uiPriority="31" w:qFormat="1"/>
+    <w:lsdException w:name="Intense Reference" w:uiPriority="32" w:qFormat="1"/>
+    <w:lsdException w:name="Book Title" w:uiPriority="33" w:qFormat="1"/>
+    <w:lsdException w:name="Bibliography" w:semiHidden="1" w:uiPriority="37" w:unhideWhenUsed="1"/>
+    <w:lsdException w:name="TOC Heading" w:semiHidden="1" w:uiPriority="39" w:unhideWhenUsed="1" w:qFormat="1"/>
+    <w:lsdException w:name="Plain Table 1" w:uiPriority="41"/>
+    <w:lsdException w:name="Plain Table 2" w:uiPriority="42"/>
+    <w:lsdException w:name="Plain Table 3" w:uiPriority="43"/>
+    <w:lsdException w:name="Plain Table 4" w:uiPriority="44"/>
+    <w:lsdException w:name="Plain Table 5" w:uiPriority="45"/>
+    <w:lsdException w:name="Grid Table Light" w:uiPriority="40"/>
+    <w:lsdException w:name="Grid Table 1 Light" w:uiPriority="46"/>
+    <w:lsdException w:name="Grid Table 2" w:uiPriority="47"/>
+    <w:lsdException w:name="Grid Table 3" w:uiPriority="48"/>
+    <w:lsdException w:name="Grid Table 4" w:uiPriority="49"/>
+    <w:lsdException w:name="Grid Table 5 Dark" w:uiPriority="50"/>
+    <w:lsdException w:name="Grid Table 6 Colorful" w:uiPriority="51"/>
+    <w:lsdException w:name="Grid Table 7 Colorful" w:uiPriority="52"/>
+    <w:lsdException w:name="Grid Table 1 Light Accent 1" w:uiPriority="46"/>
+    <w:lsdException w:name="Grid Table 2 Accent 1" w:uiPriority="47"/>
+    <w:lsdException w:name="Grid Table 3 Accent 1" w:uiPriority="48"/>
+    <w:lsdException w:name="Grid Table 4 Accent 1" w:uiPriority="49"/>
+    <w:lsdException w:name="Grid Table 5 Dark Accent 1" w:uiPriority="50"/>
+    <w:lsdException w:name="Grid Table 6 Colorful Accent 1" w:uiPriority="51"/>
+    <w:lsdException w:name="Grid Table 7 Colorful Accent 1" w:uiPriority="52"/>
+    <w:lsdException w:name="Grid Table 1 Light Accent 2" w:uiPriority="46"/>
+    <w:lsdException w:name="Grid Table 2 Accent 2" w:uiPriority="47"/>
+    <w:lsdException w:name="Grid Table 3 Accent 2" w:uiPriority="48"/>
+    <w:lsdException w:name="Grid Table 4 Accent 2" w:uiPriority="49"/>
+    <w:lsdException w:name="Grid Table 5 Dark Accent 2" w:uiPriority="50"/>
+    <w:lsdException w:name="Grid Table 6 Colorful Accent 2" w:uiPriority="51"/>
+    <w:lsdException w:name="Grid Table 7 Colorful Accent 2" w:uiPriority="52"/>
+    <w:lsdException w:name="Grid Table 1 Light Accent 3" w:uiPriority="46"/>
+    <w:lsdException w:name="Grid Table 2 Accent 3" w:uiPriority="47"/>
+    <w:lsdException w:name="Grid Table 3 Accent 3" w:uiPriority="48"/>
+    <w:lsdException w:name="Grid Table 4 Accent 3" w:uiPriority="49"/>
+    <w:lsdException w:name="Grid Table 5 Dark Accent 3" w:uiPriority="50"/>
+    <w:lsdException w:name="Grid Table 6 Colorful Accent 3" w:uiPriority="51"/>
+    <w:lsdException w:name="Grid Table 7 Colorful Accent 3" w:uiPriority="52"/>
+    <w:lsdException w:name="Grid Table 1 Light Accent 4" w:uiPriority="46"/>
+    <w:lsdException w:name="Grid Table 2 Accent 4" w:uiPriority="47"/>
+    <w:lsdException w:name="Grid Table 3 Accent 4" w:uiPriority="48"/>
+    <w:lsdException w:name="Grid Table 4 Accent 4" w:uiPriority="49"/>
+    <w:lsdException w:name="Grid Table 5 Dark Accent 4" w:uiPriority="50"/>
+    <w:lsdException w:name="Grid Table 6 Colorful Accent 4" w:uiPriority="51"/>
+    <w:lsdException w:name="Grid Table 7 Colorful Accent 4" w:uiPriority="52"/>
+    <w:lsdException w:name="Grid Table 1 Light Accent 5" w:uiPriority="46"/>
+    <w:lsdException w:name="Grid Table 2 Accent 5" w:uiPriority="47"/>
+    <w:lsdException w:name="Grid Table 3 Accent 5" w:uiPriority="48"/>
+    <w:lsdException w:name="Grid Table 4 Accent 5" w:uiPriority="49"/>
+    <w:lsdException w:name="Grid Table 5 Dark Accent 5" w:uiPriority="50"/>
+    <w:lsdException w:name="Grid Table 6 Colorful Accent 5" w:uiPriority="51"/>
+    <w:lsdException w:name="Grid Table 7 Colorful Accent 5" w:uiPriority="52"/>
+    <w:lsdException w:name="Grid Table 1 Light Accent 6" w:uiPriority="46"/>
+    <w:lsdException w:name="Grid Table 2 Accent 6" w:uiPriority="47"/>
+    <w:lsdException w:name="Grid Table 3 Accent 6" w:uiPriority="48"/>
+    <w:lsdException w:name="Grid Table 4 Accent 6" w:uiPriority="49"/>
+    <w:lsdException w:name="Grid Table 5 Dark Accent 6" w:uiPriority="50"/>
+    <w:lsdException w:name="Grid Table 6 Colorful Accent 6" w:uiPriority="51"/>
+    <w:lsdException w:name="Grid Table 7 Colorful Accent 6" w:uiPriority="52"/>
+    <w:lsdException w:name="List Table 1 Light" w:uiPriority="46"/>
+    <w:lsdException w:name="List Table 2" w:uiPriority="47"/>
+    <w:lsdException w:name="List Table 3" w:uiPriority="48"/>
+    <w:lsdException w:name="List Table 4" w:uiPriority="49"/>
+    <w:lsdException w:name="List Table 5 Dark" w:uiPriority="50"/>
+    <w:lsdException w:name="List Table 6 Colorful" w:uiPriority="51"/>
+    <w:lsdException w:name="List Table 7 Colorful" w:uiPriority="52"/>
+    <w:lsdException w:name="List Table 1 Light Accent 1" w:uiPriority="46"/>
+    <w:lsdException w:name="List Table 2 Accent 1" w:uiPriority="47"/>
+    <w:lsdException w:name="List Table 3 Accent 1" w:uiPriority="48"/>
+    <w:lsdException w:name="List Table 4 Accent 1" w:uiPriority="49"/>
+    <w:lsdException w:name="List Table 5 Dark Accent 1" w:uiPriority="50"/>
+    <w:lsdException w:name="List Table 6 Colorful Accent 1" w:uiPriority="51"/>
+    <w:lsdException w:name="List Table 7 Colorful Accent 1" w:uiPriority="52"/>
+    <w:lsdException w:name="List Table 1 Light Accent 2" w:uiPriority="46"/>
+    <w:lsdException w:name="List Table 2 Accent 2" w:uiPriority="47"/>
+    <w:lsdException w:name="List Table 3 Accent 2" w:uiPriority="48"/>
+    <w:lsdException w:name="List Table 4 Accent 2" w:uiPriority="49"/>
+    <w:lsdException w:name="List Table 5 Dark Accent 2" w:uiPriority="50"/>
+    <w:lsdException w:name="List Table 6 Colorful Accent 2" w:uiPriority="51"/>
+    <w:lsdException w:name="List Table 7 Colorful Accent 2" w:uiPriority="52"/>
+    <w:lsdException w:name="List Table 1 Light Accent 3" w:uiPriority="46"/>
+    <w:lsdException w:name="List Table 2 Accent 3" w:uiPriority="47"/>
+    <w:lsdException w:name="List Table 3 Accent 3" w:uiPriority="48"/>
+    <w:lsdException w:name="List Table 4 Accent 3" w:uiPriority="49"/>
+    <w:lsdException w:name="List Table 5 Dark Accent 3" w:uiPriority="50"/>
+    <w:lsdException w:name="List Table 6 Colorful Accent 3" w:uiPriority="51"/>
+    <w:lsdException w:name="List Table 7 Colorful Accent 3" w:uiPriority="52"/>
+    <w:lsdException w:name="List Table 1 Light Accent 4" w:uiPriority="46"/>
+    <w:lsdException w:name="List Table 2 Accent 4" w:uiPriority="47"/>
+    <w:lsdException w:name="List Table 3 Accent 4" w:uiPriority="48"/>
+    <w:lsdException w:name="List Table 4 Accent 4" w:uiPriority="49"/>
+    <w:lsdException w:name="List Table 5 Dark Accent 4" w:uiPriority="50"/>
+    <w:lsdException w:name="List Table 6 Colorful Accent 4" w:uiPriority="51"/>
+    <w:lsdException w:name="List Table 7 Colorful Accent 4" w:uiPriority="52"/>
+    <w:lsdException w:name="List Table 1 Light Accent 5" w:uiPriority="46"/>
+    <w:lsdException w:name="List Table 2 Accent 5" w:uiPriority="47"/>
+    <w:lsdException w:name="List Table 3 Accent 5" w:uiPriority="48"/>
+    <w:lsdException w:name="List Table 4 Accent 5" w:uiPriority="49"/>
+    <w:lsdException w:name="List Table 5 Dark Accent 5" w:uiPriority="50"/>
+    <w:lsdException w:name="List Table 6 Colorful Accent 5" w:uiPriority="51"/>
+    <w:lsdException w:name="List Table 7 Colorful Accent 5" w:uiPriority="52"/>
+    <w:lsdException w:name="List Table 1 Light Accent 6" w:uiPriority="46"/>
+    <w:lsdException w:name="List Table 2 Accent 6" w:uiPriority="47"/>
+    <w:lsdException w:name="List Table 3 Accent 6" w:uiPriority="48"/>
+    <w:lsdException w:name="List Table 4 Accent 6" w:uiPriority="49"/>
+    <w:lsdException w:name="List Table 5 Dark Accent 6" w:uiPriority="50"/>
+    <w:lsdException w:name="List Table 6 Colorful Accent 6" w:uiPriority="51"/>
+    <w:lsdException w:name="List Table 7 Colorful Accent 6" w:uiPriority="52"/>
+    <w:lsdException w:name="Mention" w:semiHidden="1" w:unhideWhenUsed="1"/>
+    <w:lsdException w:name="Smart Hyperlink" w:semiHidden="1" w:unhideWhenUsed="1"/>
+    <w:lsdException w:name="Hashtag" w:semiHidden="1" w:unhideWhenUsed="1"/>
+    <w:lsdException w:name="Unresolved Mention" w:semiHidden="1" w:unhideWhenUsed="1"/>
+    <w:lsdException w:name="Smart Link" w:semiHidden="1" w:unhideWhenUsed="1"/>
   </w:latentStyles>
   <w:style w:type="paragraph" w:default="1" w:styleId="Normal">
     <w:name w:val="Normal"/>
@@ -1268,195 +1775,49 @@
     <w:semiHidden/>
     <w:unhideWhenUsed/>
   </w:style>
-</w:styles>
-</file>
-
-<file path=word/stylesWithEffects.xml><?xml version="1.0" encoding="utf-8"?>
-<w:styles xmlns:wpc="http://schemas.microsoft.com/office/word/2010/wordprocessingCanvas" xmlns:mc="http://schemas.openxmlformats.org/markup-compatibility/2006" xmlns:o="urn:schemas-microsoft-com:office:office" xmlns:r="http://schemas.openxmlformats.org/officeDocument/2006/relationships" xmlns:m="http://schemas.openxmlformats.org/officeDocument/2006/math" xmlns:v="urn:schemas-microsoft-com:vml" xmlns:wp14="http://schemas.microsoft.com/office/word/2010/wordprocessingDrawing" xmlns:wp="http://schemas.openxmlformats.org/drawingml/2006/wordprocessingDrawing" xmlns:w10="urn:schemas-microsoft-com:office:word" xmlns:w="http://schemas.openxmlformats.org/wordprocessingml/2006/main" xmlns:w14="http://schemas.microsoft.com/office/word/2010/wordml" xmlns:wpg="http://schemas.microsoft.com/office/word/2010/wordprocessingGroup" xmlns:wpi="http://schemas.microsoft.com/office/word/2010/wordprocessingInk" xmlns:wne="http://schemas.microsoft.com/office/word/2006/wordml" xmlns:wps="http://schemas.microsoft.com/office/word/2010/wordprocessingShape" mc:Ignorable="w14 wp14">
-  <w:docDefaults>
-    <w:rPrDefault>
-      <w:rPr>
-        <w:rFonts w:asciiTheme="minorHAnsi" w:eastAsiaTheme="minorHAnsi" w:hAnsiTheme="minorHAnsi" w:cstheme="minorBidi"/>
-        <w:sz w:val="22"/>
-        <w:szCs w:val="22"/>
-        <w:lang w:val="en-US" w:eastAsia="en-US" w:bidi="ar-SA"/>
-      </w:rPr>
-    </w:rPrDefault>
-    <w:pPrDefault>
-      <w:pPr>
-        <w:spacing w:after="200" w:line="276" w:lineRule="auto"/>
-      </w:pPr>
-    </w:pPrDefault>
-  </w:docDefaults>
-  <w:latentStyles w:defLockedState="0" w:defUIPriority="99" w:defSemiHidden="1" w:defUnhideWhenUsed="1" w:defQFormat="0" w:count="267">
-    <w:lsdException w:name="Normal" w:semiHidden="0" w:uiPriority="0" w:unhideWhenUsed="0" w:qFormat="1"/>
-    <w:lsdException w:name="heading 1" w:semiHidden="0" w:uiPriority="9" w:unhideWhenUsed="0" w:qFormat="1"/>
-    <w:lsdException w:name="heading 2" w:uiPriority="9" w:qFormat="1"/>
-    <w:lsdException w:name="heading 3" w:uiPriority="9" w:qFormat="1"/>
-    <w:lsdException w:name="heading 4" w:uiPriority="9" w:qFormat="1"/>
-    <w:lsdException w:name="heading 5" w:uiPriority="9" w:qFormat="1"/>
-    <w:lsdException w:name="heading 6" w:uiPriority="9" w:qFormat="1"/>
-    <w:lsdException w:name="heading 7" w:uiPriority="9" w:qFormat="1"/>
-    <w:lsdException w:name="heading 8" w:uiPriority="9" w:qFormat="1"/>
-    <w:lsdException w:name="heading 9" w:uiPriority="9" w:qFormat="1"/>
-    <w:lsdException w:name="toc 1" w:uiPriority="39"/>
-    <w:lsdException w:name="toc 2" w:uiPriority="39"/>
-    <w:lsdException w:name="toc 3" w:uiPriority="39"/>
-    <w:lsdException w:name="toc 4" w:uiPriority="39"/>
-    <w:lsdException w:name="toc 5" w:uiPriority="39"/>
-    <w:lsdException w:name="toc 6" w:uiPriority="39"/>
-    <w:lsdException w:name="toc 7" w:uiPriority="39"/>
-    <w:lsdException w:name="toc 8" w:uiPriority="39"/>
-    <w:lsdException w:name="toc 9" w:uiPriority="39"/>
-    <w:lsdException w:name="caption" w:uiPriority="35" w:qFormat="1"/>
-    <w:lsdException w:name="Title" w:semiHidden="0" w:uiPriority="10" w:unhideWhenUsed="0" w:qFormat="1"/>
-    <w:lsdException w:name="Default Paragraph Font" w:uiPriority="1"/>
-    <w:lsdException w:name="Subtitle" w:semiHidden="0" w:uiPriority="11" w:unhideWhenUsed="0" w:qFormat="1"/>
-    <w:lsdException w:name="Strong" w:semiHidden="0" w:uiPriority="22" w:unhideWhenUsed="0" w:qFormat="1"/>
-    <w:lsdException w:name="Emphasis" w:semiHidden="0" w:uiPriority="20" w:unhideWhenUsed="0" w:qFormat="1"/>
-    <w:lsdException w:name="Table Grid" w:semiHidden="0" w:uiPriority="59" w:unhideWhenUsed="0"/>
-    <w:lsdException w:name="Placeholder Text" w:unhideWhenUsed="0"/>
-    <w:lsdException w:name="No Spacing" w:semiHidden="0" w:uiPriority="1" w:unhideWhenUsed="0" w:qFormat="1"/>
-    <w:lsdException w:name="Light Shading" w:semiHidden="0" w:uiPriority="60" w:unhideWhenUsed="0"/>
-    <w:lsdException w:name="Light List" w:semiHidden="0" w:uiPriority="61" w:unhideWhenUsed="0"/>
-    <w:lsdException w:name="Light Grid" w:semiHidden="0" w:uiPriority="62" w:unhideWhenUsed="0"/>
-    <w:lsdException w:name="Medium Shading 1" w:semiHidden="0" w:uiPriority="63" w:unhideWhenUsed="0"/>
-    <w:lsdException w:name="Medium Shading 2" w:semiHidden="0" w:uiPriority="64" w:unhideWhenUsed="0"/>
-    <w:lsdException w:name="Medium List 1" w:semiHidden="0" w:uiPriority="65" w:unhideWhenUsed="0"/>
-    <w:lsdException w:name="Medium List 2" w:semiHidden="0" w:uiPriority="66" w:unhideWhenUsed="0"/>
-    <w:lsdException w:name="Medium Grid 1" w:semiHidden="0" w:uiPriority="67" w:unhideWhenUsed="0"/>
-    <w:lsdException w:name="Medium Grid 2" w:semiHidden="0" w:uiPriority="68" w:unhideWhenUsed="0"/>
-    <w:lsdException w:name="Medium Grid 3" w:semiHidden="0" w:uiPriority="69" w:unhideWhenUsed="0"/>
-    <w:lsdException w:name="Dark List" w:semiHidden="0" w:uiPriority="70" w:unhideWhenUsed="0"/>
-    <w:lsdException w:name="Colorful Shading" w:semiHidden="0" w:uiPriority="71" w:unhideWhenUsed="0"/>
-    <w:lsdException w:name="Colorful List" w:semiHidden="0" w:uiPriority="72" w:unhideWhenUsed="0"/>
-    <w:lsdException w:name="Colorful Grid" w:semiHidden="0" w:uiPriority="73" w:unhideWhenUsed="0"/>
-    <w:lsdException w:name="Light Shading Accent 1" w:semiHidden="0" w:uiPriority="60" w:unhideWhenUsed="0"/>
-    <w:lsdException w:name="Light List Accent 1" w:semiHidden="0" w:uiPriority="61" w:unhideWhenUsed="0"/>
-    <w:lsdException w:name="Light Grid Accent 1" w:semiHidden="0" w:uiPriority="62" w:unhideWhenUsed="0"/>
-    <w:lsdException w:name="Medium Shading 1 Accent 1" w:semiHidden="0" w:uiPriority="63" w:unhideWhenUsed="0"/>
-    <w:lsdException w:name="Medium Shading 2 Accent 1" w:semiHidden="0" w:uiPriority="64" w:unhideWhenUsed="0"/>
-    <w:lsdException w:name="Medium List 1 Accent 1" w:semiHidden="0" w:uiPriority="65" w:unhideWhenUsed="0"/>
-    <w:lsdException w:name="Revision" w:unhideWhenUsed="0"/>
-    <w:lsdException w:name="List Paragraph" w:semiHidden="0" w:uiPriority="34" w:unhideWhenUsed="0" w:qFormat="1"/>
-    <w:lsdException w:name="Quote" w:semiHidden="0" w:uiPriority="29" w:unhideWhenUsed="0" w:qFormat="1"/>
-    <w:lsdException w:name="Intense Quote" w:semiHidden="0" w:uiPriority="30" w:unhideWhenUsed="0" w:qFormat="1"/>
-    <w:lsdException w:name="Medium List 2 Accent 1" w:semiHidden="0" w:uiPriority="66" w:unhideWhenUsed="0"/>
-    <w:lsdException w:name="Medium Grid 1 Accent 1" w:semiHidden="0" w:uiPriority="67" w:unhideWhenUsed="0"/>
-    <w:lsdException w:name="Medium Grid 2 Accent 1" w:semiHidden="0" w:uiPriority="68" w:unhideWhenUsed="0"/>
-    <w:lsdException w:name="Medium Grid 3 Accent 1" w:semiHidden="0" w:uiPriority="69" w:unhideWhenUsed="0"/>
-    <w:lsdException w:name="Dark List Accent 1" w:semiHidden="0" w:uiPriority="70" w:unhideWhenUsed="0"/>
-    <w:lsdException w:name="Colorful Shading Accent 1" w:semiHidden="0" w:uiPriority="71" w:unhideWhenUsed="0"/>
-    <w:lsdException w:name="Colorful List Accent 1" w:semiHidden="0" w:uiPriority="72" w:unhideWhenUsed="0"/>
-    <w:lsdException w:name="Colorful Grid Accent 1" w:semiHidden="0" w:uiPriority="73" w:unhideWhenUsed="0"/>
-    <w:lsdException w:name="Light Shading Accent 2" w:semiHidden="0" w:uiPriority="60" w:unhideWhenUsed="0"/>
-    <w:lsdException w:name="Light List Accent 2" w:semiHidden="0" w:uiPriority="61" w:unhideWhenUsed="0"/>
-    <w:lsdException w:name="Light Grid Accent 2" w:semiHidden="0" w:uiPriority="62" w:unhideWhenUsed="0"/>
-    <w:lsdException w:name="Medium Shading 1 Accent 2" w:semiHidden="0" w:uiPriority="63" w:unhideWhenUsed="0"/>
-    <w:lsdException w:name="Medium Shading 2 Accent 2" w:semiHidden="0" w:uiPriority="64" w:unhideWhenUsed="0"/>
-    <w:lsdException w:name="Medium List 1 Accent 2" w:semiHidden="0" w:uiPriority="65" w:unhideWhenUsed="0"/>
-    <w:lsdException w:name="Medium List 2 Accent 2" w:semiHidden="0" w:uiPriority="66" w:unhideWhenUsed="0"/>
-    <w:lsdException w:name="Medium Grid 1 Accent 2" w:semiHidden="0" w:uiPriority="67" w:unhideWhenUsed="0"/>
-    <w:lsdException w:name="Medium Grid 2 Accent 2" w:semiHidden="0" w:uiPriority="68" w:unhideWhenUsed="0"/>
-    <w:lsdException w:name="Medium Grid 3 Accent 2" w:semiHidden="0" w:uiPriority="69" w:unhideWhenUsed="0"/>
-    <w:lsdException w:name="Dark List Accent 2" w:semiHidden="0" w:uiPriority="70" w:unhideWhenUsed="0"/>
-    <w:lsdException w:name="Colorful Shading Accent 2" w:semiHidden="0" w:uiPriority="71" w:unhideWhenUsed="0"/>
-    <w:lsdException w:name="Colorful List Accent 2" w:semiHidden="0" w:uiPriority="72" w:unhideWhenUsed="0"/>
-    <w:lsdException w:name="Colorful Grid Accent 2" w:semiHidden="0" w:uiPriority="73" w:unhideWhenUsed="0"/>
-    <w:lsdException w:name="Light Shading Accent 3" w:semiHidden="0" w:uiPriority="60" w:unhideWhenUsed="0"/>
-    <w:lsdException w:name="Light List Accent 3" w:semiHidden="0" w:uiPriority="61" w:unhideWhenUsed="0"/>
-    <w:lsdException w:name="Light Grid Accent 3" w:semiHidden="0" w:uiPriority="62" w:unhideWhenUsed="0"/>
-    <w:lsdException w:name="Medium Shading 1 Accent 3" w:semiHidden="0" w:uiPriority="63" w:unhideWhenUsed="0"/>
-    <w:lsdException w:name="Medium Shading 2 Accent 3" w:semiHidden="0" w:uiPriority="64" w:unhideWhenUsed="0"/>
-    <w:lsdException w:name="Medium List 1 Accent 3" w:semiHidden="0" w:uiPriority="65" w:unhideWhenUsed="0"/>
-    <w:lsdException w:name="Medium List 2 Accent 3" w:semiHidden="0" w:uiPriority="66" w:unhideWhenUsed="0"/>
-    <w:lsdException w:name="Medium Grid 1 Accent 3" w:semiHidden="0" w:uiPriority="67" w:unhideWhenUsed="0"/>
-    <w:lsdException w:name="Medium Grid 2 Accent 3" w:semiHidden="0" w:uiPriority="68" w:unhideWhenUsed="0"/>
-    <w:lsdException w:name="Medium Grid 3 Accent 3" w:semiHidden="0" w:uiPriority="69" w:unhideWhenUsed="0"/>
-    <w:lsdException w:name="Dark List Accent 3" w:semiHidden="0" w:uiPriority="70" w:unhideWhenUsed="0"/>
-    <w:lsdException w:name="Colorful Shading Accent 3" w:semiHidden="0" w:uiPriority="71" w:unhideWhenUsed="0"/>
-    <w:lsdException w:name="Colorful List Accent 3" w:semiHidden="0" w:uiPriority="72" w:unhideWhenUsed="0"/>
-    <w:lsdException w:name="Colorful Grid Accent 3" w:semiHidden="0" w:uiPriority="73" w:unhideWhenUsed="0"/>
-    <w:lsdException w:name="Light Shading Accent 4" w:semiHidden="0" w:uiPriority="60" w:unhideWhenUsed="0"/>
-    <w:lsdException w:name="Light List Accent 4" w:semiHidden="0" w:uiPriority="61" w:unhideWhenUsed="0"/>
-    <w:lsdException w:name="Light Grid Accent 4" w:semiHidden="0" w:uiPriority="62" w:unhideWhenUsed="0"/>
-    <w:lsdException w:name="Medium Shading 1 Accent 4" w:semiHidden="0" w:uiPriority="63" w:unhideWhenUsed="0"/>
-    <w:lsdException w:name="Medium Shading 2 Accent 4" w:semiHidden="0" w:uiPriority="64" w:unhideWhenUsed="0"/>
-    <w:lsdException w:name="Medium List 1 Accent 4" w:semiHidden="0" w:uiPriority="65" w:unhideWhenUsed="0"/>
-    <w:lsdException w:name="Medium List 2 Accent 4" w:semiHidden="0" w:uiPriority="66" w:unhideWhenUsed="0"/>
-    <w:lsdException w:name="Medium Grid 1 Accent 4" w:semiHidden="0" w:uiPriority="67" w:unhideWhenUsed="0"/>
-    <w:lsdException w:name="Medium Grid 2 Accent 4" w:semiHidden="0" w:uiPriority="68" w:unhideWhenUsed="0"/>
-    <w:lsdException w:name="Medium Grid 3 Accent 4" w:semiHidden="0" w:uiPriority="69" w:unhideWhenUsed="0"/>
-    <w:lsdException w:name="Dark List Accent 4" w:semiHidden="0" w:uiPriority="70" w:unhideWhenUsed="0"/>
-    <w:lsdException w:name="Colorful Shading Accent 4" w:semiHidden="0" w:uiPriority="71" w:unhideWhenUsed="0"/>
-    <w:lsdException w:name="Colorful List Accent 4" w:semiHidden="0" w:uiPriority="72" w:unhideWhenUsed="0"/>
-    <w:lsdException w:name="Colorful Grid Accent 4" w:semiHidden="0" w:uiPriority="73" w:unhideWhenUsed="0"/>
-    <w:lsdException w:name="Light Shading Accent 5" w:semiHidden="0" w:uiPriority="60" w:unhideWhenUsed="0"/>
-    <w:lsdException w:name="Light List Accent 5" w:semiHidden="0" w:uiPriority="61" w:unhideWhenUsed="0"/>
-    <w:lsdException w:name="Light Grid Accent 5" w:semiHidden="0" w:uiPriority="62" w:unhideWhenUsed="0"/>
-    <w:lsdException w:name="Medium Shading 1 Accent 5" w:semiHidden="0" w:uiPriority="63" w:unhideWhenUsed="0"/>
-    <w:lsdException w:name="Medium Shading 2 Accent 5" w:semiHidden="0" w:uiPriority="64" w:unhideWhenUsed="0"/>
-    <w:lsdException w:name="Medium List 1 Accent 5" w:semiHidden="0" w:uiPriority="65" w:unhideWhenUsed="0"/>
-    <w:lsdException w:name="Medium List 2 Accent 5" w:semiHidden="0" w:uiPriority="66" w:unhideWhenUsed="0"/>
-    <w:lsdException w:name="Medium Grid 1 Accent 5" w:semiHidden="0" w:uiPriority="67" w:unhideWhenUsed="0"/>
-    <w:lsdException w:name="Medium Grid 2 Accent 5" w:semiHidden="0" w:uiPriority="68" w:unhideWhenUsed="0"/>
-    <w:lsdException w:name="Medium Grid 3 Accent 5" w:semiHidden="0" w:uiPriority="69" w:unhideWhenUsed="0"/>
-    <w:lsdException w:name="Dark List Accent 5" w:semiHidden="0" w:uiPriority="70" w:unhideWhenUsed="0"/>
-    <w:lsdException w:name="Colorful Shading Accent 5" w:semiHidden="0" w:uiPriority="71" w:unhideWhenUsed="0"/>
-    <w:lsdException w:name="Colorful List Accent 5" w:semiHidden="0" w:uiPriority="72" w:unhideWhenUsed="0"/>
-    <w:lsdException w:name="Colorful Grid Accent 5" w:semiHidden="0" w:uiPriority="73" w:unhideWhenUsed="0"/>
-    <w:lsdException w:name="Light Shading Accent 6" w:semiHidden="0" w:uiPriority="60" w:unhideWhenUsed="0"/>
-    <w:lsdException w:name="Light List Accent 6" w:semiHidden="0" w:uiPriority="61" w:unhideWhenUsed="0"/>
-    <w:lsdException w:name="Light Grid Accent 6" w:semiHidden="0" w:uiPriority="62" w:unhideWhenUsed="0"/>
-    <w:lsdException w:name="Medium Shading 1 Accent 6" w:semiHidden="0" w:uiPriority="63" w:unhideWhenUsed="0"/>
-    <w:lsdException w:name="Medium Shading 2 Accent 6" w:semiHidden="0" w:uiPriority="64" w:unhideWhenUsed="0"/>
-    <w:lsdException w:name="Medium List 1 Accent 6" w:semiHidden="0" w:uiPriority="65" w:unhideWhenUsed="0"/>
-    <w:lsdException w:name="Medium List 2 Accent 6" w:semiHidden="0" w:uiPriority="66" w:unhideWhenUsed="0"/>
-    <w:lsdException w:name="Medium Grid 1 Accent 6" w:semiHidden="0" w:uiPriority="67" w:unhideWhenUsed="0"/>
-    <w:lsdException w:name="Medium Grid 2 Accent 6" w:semiHidden="0" w:uiPriority="68" w:unhideWhenUsed="0"/>
-    <w:lsdException w:name="Medium Grid 3 Accent 6" w:semiHidden="0" w:uiPriority="69" w:unhideWhenUsed="0"/>
-    <w:lsdException w:name="Dark List Accent 6" w:semiHidden="0" w:uiPriority="70" w:unhideWhenUsed="0"/>
-    <w:lsdException w:name="Colorful Shading Accent 6" w:semiHidden="0" w:uiPriority="71" w:unhideWhenUsed="0"/>
-    <w:lsdException w:name="Colorful List Accent 6" w:semiHidden="0" w:uiPriority="72" w:unhideWhenUsed="0"/>
-    <w:lsdException w:name="Colorful Grid Accent 6" w:semiHidden="0" w:uiPriority="73" w:unhideWhenUsed="0"/>
-    <w:lsdException w:name="Subtle Emphasis" w:semiHidden="0" w:uiPriority="19" w:unhideWhenUsed="0" w:qFormat="1"/>
-    <w:lsdException w:name="Intense Emphasis" w:semiHidden="0" w:uiPriority="21" w:unhideWhenUsed="0" w:qFormat="1"/>
-    <w:lsdException w:name="Subtle Reference" w:semiHidden="0" w:uiPriority="31" w:unhideWhenUsed="0" w:qFormat="1"/>
-    <w:lsdException w:name="Intense Reference" w:semiHidden="0" w:uiPriority="32" w:unhideWhenUsed="0" w:qFormat="1"/>
-    <w:lsdException w:name="Book Title" w:semiHidden="0" w:uiPriority="33" w:unhideWhenUsed="0" w:qFormat="1"/>
-    <w:lsdException w:name="Bibliography" w:uiPriority="37"/>
-    <w:lsdException w:name="TOC Heading" w:uiPriority="39" w:qFormat="1"/>
-  </w:latentStyles>
-  <w:style w:type="paragraph" w:default="1" w:styleId="Normal">
-    <w:name w:val="Normal"/>
-    <w:qFormat/>
+  <w:style w:type="paragraph" w:styleId="Header">
+    <w:name w:val="header"/>
+    <w:basedOn w:val="Normal"/>
+    <w:link w:val="HeaderChar"/>
+    <w:uiPriority w:val="99"/>
+    <w:unhideWhenUsed/>
+    <w:rsid w:val="003C3BFD"/>
+    <w:pPr>
+      <w:tabs>
+        <w:tab w:val="center" w:pos="4680"/>
+        <w:tab w:val="right" w:pos="9360"/>
+      </w:tabs>
+      <w:spacing w:after="0" w:line="240" w:lineRule="auto"/>
+    </w:pPr>
   </w:style>
-  <w:style w:type="character" w:default="1" w:styleId="DefaultParagraphFont">
-    <w:name w:val="Default Paragraph Font"/>
-    <w:uiPriority w:val="1"/>
-    <w:semiHidden/>
+  <w:style w:type="character" w:customStyle="1" w:styleId="HeaderChar">
+    <w:name w:val="Header Char"/>
+    <w:basedOn w:val="DefaultParagraphFont"/>
+    <w:link w:val="Header"/>
+    <w:uiPriority w:val="99"/>
+    <w:rsid w:val="003C3BFD"/>
+  </w:style>
+  <w:style w:type="paragraph" w:styleId="Footer">
+    <w:name w:val="footer"/>
+    <w:basedOn w:val="Normal"/>
+    <w:link w:val="FooterChar"/>
+    <w:uiPriority w:val="99"/>
     <w:unhideWhenUsed/>
+    <w:rsid w:val="003C3BFD"/>
+    <w:pPr>
+      <w:tabs>
+        <w:tab w:val="center" w:pos="4680"/>
+        <w:tab w:val="right" w:pos="9360"/>
+      </w:tabs>
+      <w:spacing w:after="0" w:line="240" w:lineRule="auto"/>
+    </w:pPr>
   </w:style>
-  <w:style w:type="table" w:default="1" w:styleId="TableNormal">
-    <w:name w:val="Normal Table"/>
+  <w:style w:type="character" w:customStyle="1" w:styleId="FooterChar">
+    <w:name w:val="Footer Char"/>
+    <w:basedOn w:val="DefaultParagraphFont"/>
+    <w:link w:val="Footer"/>
     <w:uiPriority w:val="99"/>
-    <w:semiHidden/>
-    <w:unhideWhenUsed/>
-    <w:tblPr>
-      <w:tblInd w:w="0" w:type="dxa"/>
-      <w:tblCellMar>
-        <w:top w:w="0" w:type="dxa"/>
-        <w:left w:w="108" w:type="dxa"/>
-        <w:bottom w:w="0" w:type="dxa"/>
-        <w:right w:w="108" w:type="dxa"/>
-      </w:tblCellMar>
-    </w:tblPr>
-  </w:style>
-  <w:style w:type="numbering" w:default="1" w:styleId="NoList">
-    <w:name w:val="No List"/>
-    <w:uiPriority w:val="99"/>
-    <w:semiHidden/>
-    <w:unhideWhenUsed/>
+    <w:rsid w:val="003C3BFD"/>
   </w:style>
 </w:styles>
 </file>

</xml_diff>